<commit_message>
[A43] source: native facing and observer exclusion
</commit_message>
<xml_diff>
--- a/artifacts/docx/README.docx
+++ b/artifacts/docx/README.docx
@@ -51,7 +51,7 @@
           </w:tcPr>
           <w:p>
             <w:r>
-              <w:t>`0.3.1.1-pre-alpha`</w:t>
+              <w:t>`0.5.3.0-pre-alpha`</w:t>
             </w:r>
           </w:p>
         </w:tc>
@@ -135,22 +135,27 @@
     <w:p/>
     <w:p>
       <w:r>
-        <w:t>A Project Zomboid Build 42 add-on to [Survivor Awareness</w:t>
+        <w:t>A Project Zomboid Build 42 add-on beside [Survivor Awareness</w:t>
       </w:r>
     </w:p>
     <w:p>
       <w:r>
-        <w:t>Overhaul](../survivor-awareness). SAO handles living survivors. This</w:t>
+        <w:t>Overhaul](../survivor-awareness). SAO executes ordinary living survivors and</w:t>
       </w:r>
     </w:p>
     <w:p>
       <w:r>
-        <w:t>handles a body after it turns, and the handover happens at death. With</w:t>
+        <w:t>provides county services. ZAO executes turned bodies and the living Afflicted</w:t>
       </w:r>
     </w:p>
     <w:p>
       <w:r>
-        <w:t>ZAO disabled, vanilla handles every corpse.</w:t>
+        <w:t>and Crossed states its pathogen creates. With ZAO disabled, vanilla handles</w:t>
+      </w:r>
+    </w:p>
+    <w:p>
+      <w:r>
+        <w:t>every corpse and those ZAO living states are not produced.</w:t>
       </w:r>
     </w:p>
     <w:p/>
@@ -275,32 +280,520 @@
     <w:p/>
     <w:p>
       <w:r>
-        <w:t>The runtime controller claims every zombie that carries `SAOPersonId`, drives</w:t>
+        <w:t>The runtime controller claims every valid turned zombie that carries</w:t>
       </w:r>
     </w:p>
     <w:p>
       <w:r>
-        <w:t>it according to its form, and writes the form and performance into modData for</w:t>
+        <w:t>`SAOPersonId`, drives it according to its form, and writes the form and</w:t>
       </w:r>
     </w:p>
     <w:p>
       <w:r>
-        <w:t>Perception. Puker holds range, Skitter flanks, and the remaining forms close on</w:t>
+        <w:t>performance into modData for Perception. Puker holds range, Skitter flanks,</w:t>
       </w:r>
     </w:p>
     <w:p>
       <w:r>
-        <w:t>the target. The Java bridge applies per-form speed, strength, cognition,</w:t>
+        <w:t>and the remaining forms close on the target. The Java bridge applies per-form</w:t>
       </w:r>
     </w:p>
     <w:p>
       <w:r>
-        <w:t>memory, sight, and hearing, and exposes the same ownership, form, and</w:t>
+        <w:t>speed, strength, cognition, memory, sight, and hearing, and exposes the same</w:t>
       </w:r>
     </w:p>
     <w:p>
       <w:r>
-        <w:t>performance queries to Lua.</w:t>
+        <w:t>ownership, form, and performance queries to Lua.</w:t>
+      </w:r>
+    </w:p>
+    <w:p/>
+    <w:p>
+      <w:r>
+        <w:t>A35/A36 also establish the durable Afflicted-return boundary with SAO. ZAO holds</w:t>
+      </w:r>
+    </w:p>
+    <w:p>
+      <w:r>
+        <w:t>the exact old source until the living destination is committed, reconstructs</w:t>
+      </w:r>
+    </w:p>
+    <w:p>
+      <w:r>
+        <w:t>runtime controllers and courses from durable records, and uses a generation</w:t>
+      </w:r>
+    </w:p>
+    <w:p>
+      <w:r>
+        <w:t>journal to reconcile interrupted saves across the engine's separate native and</w:t>
+      </w:r>
+    </w:p>
+    <w:p>
+      <w:r>
+        <w:t>global persistence surfaces. This closes return ownership and reconstruction;</w:t>
+      </w:r>
+    </w:p>
+    <w:p>
+      <w:r>
+        <w:t>the canonical Crossed human action system remains open in the sister roadmap.</w:t>
+      </w:r>
+    </w:p>
+    <w:p/>
+    <w:p>
+      <w:r>
+        <w:t>A37 implements the opposite ownership direction for an Afflicted person who</w:t>
+      </w:r>
+    </w:p>
+    <w:p>
+      <w:r>
+        <w:t>becomes Crossed. A reachable Crossed decision approaches and holds contact</w:t>
+      </w:r>
+    </w:p>
+    <w:p>
+      <w:r>
+        <w:t>through an interruptible blood action. That exposure action does not itself</w:t>
+      </w:r>
+    </w:p>
+    <w:p>
+      <w:r>
+        <w:t>feed; only the completed durable action can produce the existing</w:t>
+      </w:r>
+    </w:p>
+    <w:p>
+      <w:r>
+        <w:t>Crossed-odds times susceptibility roll. Success transfers the same living human</w:t>
+      </w:r>
+    </w:p>
+    <w:p>
+      <w:r>
+        <w:t>shell and dormant snapshot from SAO to ZAO exactly once, with retry across busy</w:t>
+      </w:r>
+    </w:p>
+    <w:p>
+      <w:r>
+        <w:t>state, save/reload and later death. This closes the exposure/ownership slice;</w:t>
+      </w:r>
+    </w:p>
+    <w:p>
+      <w:r>
+        <w:t>at A37, retained weapons, tools, strategy and the wider human action vocabulary</w:t>
+      </w:r>
+    </w:p>
+    <w:p>
+      <w:r>
+        <w:t>were still unfinished.</w:t>
+      </w:r>
+    </w:p>
+    <w:p/>
+    <w:p>
+      <w:r>
+        <w:t>A38 makes that retained human shell the Crossed person's actual communication</w:t>
+      </w:r>
+    </w:p>
+    <w:p>
+      <w:r>
+        <w:t>and shared-work body. The registered ZAO execution owner reports current</w:t>
+      </w:r>
+    </w:p>
+    <w:p>
+      <w:r>
+        <w:t>activity and only the capabilities the retained mind still supports. A threat</w:t>
+      </w:r>
+    </w:p>
+    <w:p>
+      <w:r>
+        <w:t>can interrupt the work; accepted work can own a tick; otherwise ordinary</w:t>
+      </w:r>
+    </w:p>
+    <w:p>
+      <w:r>
+        <w:t>Crossed deliberation continues. A Crossed-linked `IsoZombie` is rejected before</w:t>
+      </w:r>
+    </w:p>
+    <w:p>
+      <w:r>
+        <w:t>all admission side effects because it is not an alternate representation of</w:t>
+      </w:r>
+    </w:p>
+    <w:p>
+      <w:r>
+        <w:t>the human-looking Crossed. This is mechanically controlled, not yet observed</w:t>
+      </w:r>
+    </w:p>
+    <w:p>
+      <w:r>
+        <w:t>in loaded-world play.</w:t>
+      </w:r>
+    </w:p>
+    <w:p/>
+    <w:p>
+      <w:r>
+        <w:t>A39 corrects the remaining living-state ownership split. An authorized</w:t>
+      </w:r>
+    </w:p>
+    <w:p>
+      <w:r>
+        <w:t>Afflicted return now enters the same durable ZAO driver a Crossed person uses;</w:t>
+      </w:r>
+    </w:p>
+    <w:p>
+      <w:r>
+        <w:t>conversion changes policy without replacing the executor. Afflicted fear</w:t>
+      </w:r>
+    </w:p>
+    <w:p>
+      <w:r>
+        <w:t>observed Crossed, seek actual Afflicted peers and travel to evidenced ground.</w:t>
+      </w:r>
+    </w:p>
+    <w:p>
+      <w:r>
+        <w:t>They require water, prefer meat/protein, can use penalized non-dairy alternatives</w:t>
+      </w:r>
+    </w:p>
+    <w:p>
+      <w:r>
+        <w:t>and may individually choose human-origin food with donor-conditioned exposure</w:t>
+      </w:r>
+    </w:p>
+    <w:p>
+      <w:r>
+        <w:t>protection. Crossed retain ordinary human caloric passage, so ordinary food can</w:t>
+      </w:r>
+    </w:p>
+    <w:p>
+      <w:r>
+        <w:t>sustain them. Human flesh remains preferred where sustenance,</w:t>
+      </w:r>
+    </w:p>
+    <w:p>
+      <w:r>
+        <w:t>cruelty, domination, fear and contagion reinforce one another; eligible human</w:t>
+      </w:r>
+    </w:p>
+    <w:p>
+      <w:r>
+        <w:t>corpses can be butchered and their origin retained through cooked dishes, but</w:t>
+      </w:r>
+    </w:p>
+    <w:p>
+      <w:r>
+        <w:t>Afflicted donor provenance is categorically unavailable to Crossed feeding.</w:t>
+      </w:r>
+    </w:p>
+    <w:p>
+      <w:r>
+        <w:t>Crossed blood can be deliberately prepared on an equipped melee or projectile</w:t>
+      </w:r>
+    </w:p>
+    <w:p>
+      <w:r>
+        <w:t>weapon for finite native hits, while an Afflicted target still uses the</w:t>
+      </w:r>
+    </w:p>
+    <w:p>
+      <w:r>
+        <w:t>separate intentional-exposure action. Target options use the actor's private</w:t>
+      </w:r>
+    </w:p>
+    <w:p>
+      <w:r>
+        <w:t>observations rather than a controller-wide nearest-person scan. These are first</w:t>
+      </w:r>
+    </w:p>
+    <w:p>
+      <w:r>
+        <w:t>material producers, not a closed Crossed feature list or automatic behavior</w:t>
+      </w:r>
+    </w:p>
+    <w:p>
+      <w:r>
+        <w:t>loop. Borders 12 and 13 cover the mechanisms headlessly; loaded-world play</w:t>
+      </w:r>
+    </w:p>
+    <w:p>
+      <w:r>
+        <w:t>remains unobserved.</w:t>
+      </w:r>
+    </w:p>
+    <w:p/>
+    <w:p>
+      <w:r>
+        <w:t>A40 gives both living states durable shared matters without making their</w:t>
+      </w:r>
+    </w:p>
+    <w:p>
+      <w:r>
+        <w:t>motives interchangeable. Afflicted raise and revise food or water provisioning</w:t>
+      </w:r>
+    </w:p>
+    <w:p>
+      <w:r>
+        <w:t>from actual personal or settlement necessity, then withdraw it when the need</w:t>
+      </w:r>
+    </w:p>
+    <w:p>
+      <w:r>
+        <w:t>resolves. Crossed raise bounded rendezvous/holding proposals to currently</w:t>
+      </w:r>
+    </w:p>
+    <w:p>
+      <w:r>
+        <w:t>evidenced associates and ground. Each recipient answers from current ZAO-owned</w:t>
+      </w:r>
+    </w:p>
+    <w:p>
+      <w:r>
+        <w:t>activity, capability, pressure, relationships and disposition after actual</w:t>
+      </w:r>
+    </w:p>
+    <w:p>
+      <w:r>
+        <w:t>communication. Accepted work uses SAO's native acquisition, handover and</w:t>
+      </w:r>
+    </w:p>
+    <w:p>
+      <w:r>
+        <w:t>locomotion owners; rendezvous completes only at the exact promised arrival.</w:t>
+      </w:r>
+    </w:p>
+    <w:p>
+      <w:r>
+        <w:t>Conversion retains the process but reappraises it through current Crossed</w:t>
+      </w:r>
+    </w:p>
+    <w:p>
+      <w:r>
+        <w:t>policy. Border 15 controls this combined path headlessly; loaded-world behavior</w:t>
+      </w:r>
+    </w:p>
+    <w:p>
+      <w:r>
+        <w:t>remains unobserved.</w:t>
+      </w:r>
+    </w:p>
+    <w:p/>
+    <w:p>
+      <w:r>
+        <w:t>A41 makes that common execution owner available without the loaded Controller.</w:t>
+      </w:r>
+    </w:p>
+    <w:p>
+      <w:r>
+        <w:t>The shared adapter resolves the real retained human shell when present, exposes</w:t>
+      </w:r>
+    </w:p>
+    <w:p>
+      <w:r>
+        <w:t>current `ZAO.Driver` activity/capability/pressure, and dispatches the final</w:t>
+      </w:r>
+    </w:p>
+    <w:p>
+      <w:r>
+        <w:t>response to the current Afflicted or Crossed policy. Dormant and headless</w:t>
+      </w:r>
+    </w:p>
+    <w:p>
+      <w:r>
+        <w:t>coordination therefore cannot fall back into SAO ownership. A missing shell</w:t>
+      </w:r>
+    </w:p>
+    <w:p>
+      <w:r>
+        <w:t>remains an observation gap; no alternate body, mortality, migration or</w:t>
+      </w:r>
+    </w:p>
+    <w:p>
+      <w:r>
+        <w:t>conversion rule is inferred. Updated Borders 11 and 15 control the shared seam;</w:t>
+      </w:r>
+    </w:p>
+    <w:p>
+      <w:r>
+        <w:t>loaded-world behavior remains unobserved.</w:t>
+      </w:r>
+    </w:p>
+    <w:p/>
+    <w:p>
+      <w:r>
+        <w:t>A42 continues each state-authored matter through actual retained contacts in</w:t>
+      </w:r>
+    </w:p>
+    <w:p>
+      <w:r>
+        <w:t>loaded, dormant and headless execution. Address arrival does not establish</w:t>
+      </w:r>
+    </w:p>
+    <w:p>
+      <w:r>
+        <w:t>hearing; reception, private appraisal and the returned answer remain distinct.</w:t>
+      </w:r>
+    </w:p>
+    <w:p>
+      <w:r>
+        <w:t>It also corrects Crossed maintenance: the retained human shell uses ordinary</w:t>
+      </w:r>
+    </w:p>
+    <w:p>
+      <w:r>
+        <w:t>human caloric passage, and no reduced-calorie multiplier is applied. Crossed</w:t>
+      </w:r>
+    </w:p>
+    <w:p>
+      <w:r>
+        <w:t>may use ordinary food and eligible ordinary-human provenance, but cannot feed</w:t>
+      </w:r>
+    </w:p>
+    <w:p>
+      <w:r>
+        <w:t>on Afflicted. Donor identity is revalidated through raw items, evolved dishes</w:t>
+      </w:r>
+    </w:p>
+    <w:p>
+      <w:r>
+        <w:t>and every timed/native action boundary; anonymous legacy human-origin food</w:t>
+      </w:r>
+    </w:p>
+    <w:p>
+      <w:r>
+        <w:t>fails closed. Intentional blood exposure remains separate. Afflicted food</w:t>
+      </w:r>
+    </w:p>
+    <w:p>
+      <w:r>
+        <w:t>policy is unchanged. These paths are mechanically controlled; loaded-world</w:t>
+      </w:r>
+    </w:p>
+    <w:p>
+      <w:r>
+        <w:t>presentation and long-horizon ecology remain unobserved.</w:t>
+      </w:r>
+    </w:p>
+    <w:p/>
+    <w:p>
+      <w:r>
+        <w:t>A43 repairs native form facing and vocals and integrates detached-observer exclusion.</w:t>
+      </w:r>
+    </w:p>
+    <w:p>
+      <w:r>
+        <w:t>Puker, Wrecker and Leaper windups call the installed</w:t>
+      </w:r>
+    </w:p>
+    <w:p>
+      <w:r>
+        <w:t>`faceThisObject(IsoObject)` method, verified by reflection and production</w:t>
+      </w:r>
+    </w:p>
+    <w:p>
+      <w:r>
+        <w:t>execution in Kahlua with the original invalid call as a failing control.</w:t>
+      </w:r>
+    </w:p>
+    <w:p>
+      <w:r>
+        <w:t>Vocal cues use the body's native voice name through its character sound emitter;</w:t>
+      </w:r>
+    </w:p>
+    <w:p>
+      <w:r>
+        <w:t>the missing body-level vocal call is a second failing control.</w:t>
+      </w:r>
+    </w:p>
+    <w:p>
+      <w:r>
+        <w:t>The actor-facing `ZAO.Participants.player(index)` lookup excludes an engine</w:t>
+      </w:r>
+    </w:p>
+    <w:p>
+      <w:r>
+        <w:t>slot marked `SAO_ObserverAnchor` from ZAO's player targeting, Weeper listeners,</w:t>
+      </w:r>
+    </w:p>
+    <w:p>
+      <w:r>
+        <w:t>inspector and overlay. `ZAO.Participants.residencyCenter()` separately supplies</w:t>
+      </w:r>
+    </w:p>
+    <w:p>
+      <w:r>
+        <w:t>the infrastructure coordinates used by the Controller to materialize nearby</w:t>
+      </w:r>
+    </w:p>
+    <w:p>
+      <w:r>
+        <w:t>and hibernate distant living Afflicted and Crossed. The observed region can</w:t>
+      </w:r>
+    </w:p>
+    <w:p>
+      <w:r>
+        <w:t>therefore host those people without admitting the observer as a participant.</w:t>
+      </w:r>
+    </w:p>
+    <w:p>
+      <w:r>
+        <w:t>The Controller also honors SAO's body-recovery result: unresolved native unload</w:t>
+      </w:r>
+    </w:p>
+    <w:p>
+      <w:r>
+        <w:t>retains ownership while withholding driving and materialization.</w:t>
+      </w:r>
+    </w:p>
+    <w:p>
+      <w:r>
+        <w:t>Border 9 exercises the production Controller and Participants for both states</w:t>
+      </w:r>
+    </w:p>
+    <w:p>
+      <w:r>
+        <w:t>and rejects four lifecycle controls, including residency and native unload.</w:t>
+      </w:r>
+    </w:p>
+    <w:p>
+      <w:r>
+        <w:t>The expanded sixteen-border gate passes with no skips and exit code zero.</w:t>
+      </w:r>
+    </w:p>
+    <w:p>
+      <w:r>
+        <w:t>Native workbench run 19</w:t>
+      </w:r>
+    </w:p>
+    <w:p>
+      <w:r>
+        <w:t>verifies the engine hook and separation of manual panning from region residency;</w:t>
+      </w:r>
+    </w:p>
+    <w:p>
+      <w:r>
+        <w:t>it stopped and saved with zero player membership. Same-save attempt 2 has</w:t>
+      </w:r>
+    </w:p>
+    <w:p>
+      <w:r>
+        <w:t>resumed cleanly from game hour 2.659274 with the same 32 people and new</w:t>
+      </w:r>
+    </w:p>
+    <w:p>
+      <w:r>
+        <w:t>observation sequence 4. The reopened attempt's final stop and the broader SAO</w:t>
+      </w:r>
+    </w:p>
+    <w:p>
+      <w:r>
+        <w:t>body-visibility repair remain pending. A43 closes facing/vocals, participant exclusion</w:t>
+      </w:r>
+    </w:p>
+    <w:p>
+      <w:r>
+        <w:t>and residency; overall observer acceptance remains separate. Observed scenarios</w:t>
+      </w:r>
+    </w:p>
+    <w:p>
+      <w:r>
+        <w:t>require operator evaluation before dataset ratification.</w:t>
       </w:r>
     </w:p>
     <w:p/>

</xml_diff>

<commit_message>
[A44] source: Living orientation and elapsed rollback
</commit_message>
<xml_diff>
--- a/artifacts/docx/README.docx
+++ b/artifacts/docx/README.docx
@@ -2,236 +2,223 @@
 <file path=word/document.xml><?xml version="1.0" encoding="utf-8"?>
 <w:document xmlns:wpc="http://schemas.microsoft.com/office/word/2010/wordprocessingCanvas" xmlns:mo="http://schemas.microsoft.com/office/mac/office/2008/main" xmlns:mc="http://schemas.openxmlformats.org/markup-compatibility/2006" xmlns:mv="urn:schemas-microsoft-com:mac:vml" xmlns:o="urn:schemas-microsoft-com:office:office" xmlns:r="http://schemas.openxmlformats.org/officeDocument/2006/relationships" xmlns:m="http://schemas.openxmlformats.org/officeDocument/2006/math" xmlns:v="urn:schemas-microsoft-com:vml" xmlns:wp14="http://schemas.microsoft.com/office/word/2010/wordprocessingDrawing" xmlns:wp="http://schemas.openxmlformats.org/drawingml/2006/wordprocessingDrawing" xmlns:w10="urn:schemas-microsoft-com:office:word" xmlns:w="http://schemas.openxmlformats.org/wordprocessingml/2006/main" xmlns:w14="http://schemas.microsoft.com/office/word/2010/wordml" xmlns:wpg="http://schemas.microsoft.com/office/word/2010/wordprocessingGroup" xmlns:wpi="http://schemas.microsoft.com/office/word/2010/wordprocessingInk" xmlns:wne="http://schemas.microsoft.com/office/word/2006/wordml" xmlns:wps="http://schemas.microsoft.com/office/word/2010/wordprocessingShape" mc:Ignorable="w14 wp14">
   <w:body>
+    <w:p>
+      <w:pPr>
+        <w:jc w:val="center"/>
+      </w:pPr>
+      <w:r>
+        <w:rPr>
+          <w:rFonts w:ascii="Aptos Display" w:hAnsi="Aptos Display"/>
+          <w:b/>
+          <w:color w:val="316273"/>
+          <w:sz w:val="48"/>
+        </w:rPr>
+        <w:t>Zombie Awareness Overhaul</w:t>
+      </w:r>
+    </w:p>
     <w:tbl>
       <w:tblPr>
         <w:tblStyle w:val="TableGrid"/>
-        <w:tblW w:type="auto" w:w="0"/>
+        <w:tblW w:type="dxa" w:w="10166"/>
+        <w:jc w:val="center"/>
+        <w:tblLayout w:type="fixed"/>
         <w:tblLook w:firstColumn="1" w:firstRow="1" w:lastColumn="0" w:lastRow="0" w:noHBand="0" w:noVBand="1" w:val="04A0"/>
+        <w:tblInd w:type="dxa" w:w="120"/>
       </w:tblPr>
       <w:tblGrid>
-        <w:gridCol w:w="4320"/>
-        <w:gridCol w:w="4320"/>
+        <w:gridCol w:w="3129"/>
+        <w:gridCol w:w="7037"/>
       </w:tblGrid>
       <w:tr>
+        <w:trPr>
+          <w:cantSplit/>
+          <w:tblHeader/>
+        </w:trPr>
         <w:tc>
           <w:tcPr>
-            <w:tcW w:type="dxa" w:w="4320"/>
+            <w:tcW w:type="dxa" w:w="3129"/>
+            <w:shd w:fill="316273"/>
           </w:tcPr>
           <w:p>
             <w:r>
+              <w:rPr>
+                <w:rFonts w:ascii="Aptos" w:hAnsi="Aptos"/>
+                <w:b/>
+                <w:color w:val="FFFFFF"/>
+                <w:sz w:val="16"/>
+              </w:rPr>
               <w:t>Document</w:t>
             </w:r>
           </w:p>
         </w:tc>
         <w:tc>
           <w:tcPr>
-            <w:tcW w:type="dxa" w:w="4320"/>
+            <w:tcW w:type="dxa" w:w="7037"/>
+            <w:shd w:fill="316273"/>
           </w:tcPr>
           <w:p>
             <w:r>
+              <w:rPr>
+                <w:rFonts w:ascii="Aptos" w:hAnsi="Aptos"/>
+                <w:b/>
+                <w:color w:val="FFFFFF"/>
+                <w:sz w:val="16"/>
+              </w:rPr>
               <w:t>Zombie Awareness Overhaul</w:t>
             </w:r>
           </w:p>
         </w:tc>
       </w:tr>
       <w:tr>
+        <w:trPr>
+          <w:cantSplit/>
+        </w:trPr>
         <w:tc>
           <w:tcPr>
-            <w:tcW w:type="dxa" w:w="4320"/>
+            <w:tcW w:type="dxa" w:w="3129"/>
           </w:tcPr>
           <w:p>
             <w:r>
+              <w:rPr>
+                <w:rFonts w:ascii="Aptos" w:hAnsi="Aptos"/>
+                <w:sz w:val="16"/>
+              </w:rPr>
               <w:t>Version</w:t>
             </w:r>
           </w:p>
         </w:tc>
         <w:tc>
           <w:tcPr>
-            <w:tcW w:type="dxa" w:w="4320"/>
+            <w:tcW w:type="dxa" w:w="7037"/>
           </w:tcPr>
           <w:p>
             <w:r>
-              <w:t>`0.5.3.0-pre-alpha`</w:t>
+              <w:rPr>
+                <w:rFonts w:ascii="Aptos" w:hAnsi="Aptos"/>
+                <w:sz w:val="16"/>
+              </w:rPr>
+              <w:t>0.5.4.0-pre-alpha</w:t>
             </w:r>
           </w:p>
         </w:tc>
       </w:tr>
       <w:tr>
+        <w:trPr>
+          <w:cantSplit/>
+        </w:trPr>
         <w:tc>
           <w:tcPr>
-            <w:tcW w:type="dxa" w:w="4320"/>
+            <w:tcW w:type="dxa" w:w="3129"/>
+            <w:shd w:fill="EAF1F3"/>
           </w:tcPr>
           <w:p>
             <w:r>
+              <w:rPr>
+                <w:rFonts w:ascii="Aptos" w:hAnsi="Aptos"/>
+                <w:sz w:val="16"/>
+              </w:rPr>
               <w:t>Author</w:t>
             </w:r>
           </w:p>
         </w:tc>
         <w:tc>
           <w:tcPr>
-            <w:tcW w:type="dxa" w:w="4320"/>
+            <w:tcW w:type="dxa" w:w="7037"/>
+            <w:shd w:fill="EAF1F3"/>
           </w:tcPr>
           <w:p>
             <w:r>
+              <w:rPr>
+                <w:rFonts w:ascii="Aptos" w:hAnsi="Aptos"/>
+                <w:sz w:val="16"/>
+              </w:rPr>
               <w:t>ellyj3rain</w:t>
             </w:r>
           </w:p>
         </w:tc>
       </w:tr>
       <w:tr>
+        <w:trPr>
+          <w:cantSplit/>
+        </w:trPr>
         <w:tc>
           <w:tcPr>
-            <w:tcW w:type="dxa" w:w="4320"/>
+            <w:tcW w:type="dxa" w:w="3129"/>
           </w:tcPr>
           <w:p>
             <w:r>
+              <w:rPr>
+                <w:rFonts w:ascii="Aptos" w:hAnsi="Aptos"/>
+                <w:sz w:val="16"/>
+              </w:rPr>
               <w:t>Repository</w:t>
             </w:r>
           </w:p>
         </w:tc>
         <w:tc>
           <w:tcPr>
-            <w:tcW w:type="dxa" w:w="4320"/>
+            <w:tcW w:type="dxa" w:w="7037"/>
           </w:tcPr>
           <w:p>
             <w:r>
-              <w:t>`README.md`</w:t>
+              <w:rPr>
+                <w:rFonts w:ascii="Aptos" w:hAnsi="Aptos"/>
+                <w:sz w:val="16"/>
+              </w:rPr>
+              <w:t>README.md</w:t>
             </w:r>
           </w:p>
         </w:tc>
       </w:tr>
       <w:tr>
+        <w:trPr>
+          <w:cantSplit/>
+        </w:trPr>
         <w:tc>
           <w:tcPr>
-            <w:tcW w:type="dxa" w:w="4320"/>
+            <w:tcW w:type="dxa" w:w="3129"/>
+            <w:shd w:fill="EAF1F3"/>
           </w:tcPr>
           <w:p>
             <w:r>
+              <w:rPr>
+                <w:rFonts w:ascii="Aptos" w:hAnsi="Aptos"/>
+                <w:sz w:val="16"/>
+              </w:rPr>
               <w:t>Status</w:t>
             </w:r>
           </w:p>
         </w:tc>
         <w:tc>
           <w:tcPr>
-            <w:tcW w:type="dxa" w:w="4320"/>
+            <w:tcW w:type="dxa" w:w="7037"/>
+            <w:shd w:fill="EAF1F3"/>
           </w:tcPr>
           <w:p>
             <w:r>
+              <w:rPr>
+                <w:rFonts w:ascii="Aptos" w:hAnsi="Aptos"/>
+                <w:sz w:val="16"/>
+              </w:rPr>
               <w:t>CANONICAL - human entry point.</w:t>
             </w:r>
           </w:p>
         </w:tc>
       </w:tr>
     </w:tbl>
-    <w:p/>
-    <w:p>
-      <w:pPr>
-        <w:pStyle w:val="Heading1"/>
-      </w:pPr>
-      <w:r>
-        <w:t>Zombie Awareness Overhaul</w:t>
-      </w:r>
-    </w:p>
-    <w:p/>
     <w:p>
       <w:r>
-        <w:t>A Project Zomboid Build 42 add-on beside [Survivor Awareness</w:t>
+        <w:t>A Project Zomboid Build 42 add-on beside Survivor Awareness Overhaul. SAO executes ordinary living survivors and provides county services. ZAO executes turned bodies and the living Afflicted and Crossed states its pathogen creates. With ZAO disabled, vanilla handles every corpse and those ZAO living states are not produced.</w:t>
       </w:r>
     </w:p>
     <w:p>
       <w:r>
-        <w:t>Overhaul](../survivor-awareness). SAO executes ordinary living survivors and</w:t>
+        <w:t>The architecture across the three repositories - what SAO, ZAO and Speakeasy each own, and the three seams between them - is held in ../survivor-awareness/PROJECTS.md, which is PROJECTS.md on the forge. The relative path is for a reader with the three repositories side by side, which is how they are worked on; the link is for a reader who has only this one.</w:t>
       </w:r>
     </w:p>
     <w:p>
       <w:r>
-        <w:t>provides county services. ZAO executes turned bodies and the living Afflicted</w:t>
-      </w:r>
-    </w:p>
-    <w:p>
-      <w:r>
-        <w:t>and Crossed states its pathogen creates. With ZAO disabled, vanilla handles</w:t>
-      </w:r>
-    </w:p>
-    <w:p>
-      <w:r>
-        <w:t>every corpse and those ZAO living states are not produced.</w:t>
-      </w:r>
-    </w:p>
-    <w:p/>
-    <w:p>
-      <w:r>
-        <w:t>The architecture across the three repositories - what SAO, ZAO and</w:t>
-      </w:r>
-    </w:p>
-    <w:p>
-      <w:r>
-        <w:t>[Speakeasy](../zomboid-speakeasy) each own, and the three seams between</w:t>
-      </w:r>
-    </w:p>
-    <w:p>
-      <w:r>
-        <w:t>them - is held in `../survivor-awareness/PROJECTS.md`, which is</w:t>
-      </w:r>
-    </w:p>
-    <w:p>
-      <w:r>
-        <w:t>[`PROJECTS.md`](https://github.com/ellyj3rain/sao/blob/main/PROJECTS.md)</w:t>
-      </w:r>
-    </w:p>
-    <w:p>
-      <w:r>
-        <w:t>on the forge. The relative path is for a reader with the three</w:t>
-      </w:r>
-    </w:p>
-    <w:p>
-      <w:r>
-        <w:t>repositories side by side, which is how they are worked on; the link</w:t>
-      </w:r>
-    </w:p>
-    <w:p>
-      <w:r>
-        <w:t>is for a reader who has only this one.</w:t>
-      </w:r>
-    </w:p>
-    <w:p/>
-    <w:p>
-      <w:r>
         <w:t>Two mechanisms, litigated separately and never merged:</w:t>
-      </w:r>
-    </w:p>
-    <w:p/>
-    <w:p>
-      <w:pPr>
-        <w:pStyle w:val="ListBullet"/>
-      </w:pPr>
-      <w:r>
-        <w:t>**Zombie intelligence** — modeled decay and neurodegeneration. A turned</w:t>
-      </w:r>
-    </w:p>
-    <w:p>
-      <w:r>
-        <w:t xml:space="preserve">  body acts on its person's own SAO record as that record degrades. It</w:t>
-      </w:r>
-    </w:p>
-    <w:p>
-      <w:r>
-        <w:t xml:space="preserve">  retains what they had perceived and the actions they could perform, and</w:t>
-      </w:r>
-    </w:p>
-    <w:p>
-      <w:r>
-        <w:t xml:space="preserve">  loses both over time at a rate that differs per body. Groups of the</w:t>
-      </w:r>
-    </w:p>
-    <w:p>
-      <w:r>
-        <w:t xml:space="preserve">  turned can form settlements the way living survivors do. That is rare by</w:t>
-      </w:r>
-    </w:p>
-    <w:p>
-      <w:r>
-        <w:t xml:space="preserve">  design and is built complete rather than stubbed.</w:t>
       </w:r>
     </w:p>
     <w:p>
@@ -239,721 +226,162 @@
         <w:pStyle w:val="ListBullet"/>
       </w:pPr>
       <w:r>
-        <w:t>**Decay and mutation** — the pathogen's own mechanics, on two ledgers:</w:t>
+        <w:t>Zombie intelligence — modeled decay and neurodegeneration. A turned</w:t>
       </w:r>
     </w:p>
     <w:p>
       <w:r>
-        <w:t xml:space="preserve">  what Knox does to bodies through which routes, and what anyone is</w:t>
+        <w:t>body acts on its person's own SAO record as that record degrades. It retains what they had perceived and the actions they could perform, and loses both over time at a rate that differs per body. Groups of the turned can form settlements the way living survivors do. That is rare by design and is built complete rather than stubbed.</w:t>
+      </w:r>
+    </w:p>
+    <w:p>
+      <w:pPr>
+        <w:pStyle w:val="ListBullet"/>
+      </w:pPr>
+      <w:r>
+        <w:t>Decay and mutation — the pathogen's own mechanics, on two ledgers:</w:t>
       </w:r>
     </w:p>
     <w:p>
       <w:r>
-        <w:t xml:space="preserve">  permitted to know about it. No capability here requires another mod to</w:t>
+        <w:t>what Knox does to bodies through which routes, and what anyone is permitted to know about it. No capability here requires another mod to be installed. Mutation moves on separate axes whose definition is reserved to the operator.</w:t>
       </w:r>
     </w:p>
     <w:p>
-      <w:r>
-        <w:t xml:space="preserve">  be installed. Mutation moves on separate axes whose definition is</w:t>
-      </w:r>
-    </w:p>
-    <w:p>
-      <w:r>
-        <w:t xml:space="preserve">  reserved to the operator.</w:t>
-      </w:r>
-    </w:p>
-    <w:p/>
-    <w:p>
       <w:pPr>
-        <w:pStyle w:val="Heading2"/>
+        <w:pStyle w:val="Heading1"/>
       </w:pPr>
       <w:r>
         <w:t>Status</w:t>
       </w:r>
     </w:p>
-    <w:p/>
     <w:p>
       <w:r>
         <w:t>ZAO now ships a complete mod tree.</w:t>
       </w:r>
     </w:p>
-    <w:p/>
     <w:p>
       <w:r>
-        <w:t>The runtime controller claims every valid turned zombie that carries</w:t>
+        <w:t>The runtime controller claims every valid turned zombie that carries SAOPersonId, drives it according to its form, and writes the form and performance into modData for Perception. Puker holds range, Skitter flanks, and the remaining forms close on the target. The Java bridge applies per-form speed, strength, cognition, memory, sight, and hearing, and exposes the same ownership, form, and performance queries to Lua.</w:t>
       </w:r>
     </w:p>
     <w:p>
       <w:r>
-        <w:t>`SAOPersonId`, drives it according to its form, and writes the form and</w:t>
+        <w:t>A35/A36 also establish the durable Afflicted-return boundary with SAO. ZAO holds the exact old source until the living destination is committed, reconstructs runtime controllers and courses from durable records, and uses a generation journal to reconcile interrupted saves across the engine's separate native and global persistence surfaces. This closes return ownership and reconstruction; the canonical Crossed human action system remains open in the sister roadmap.</w:t>
       </w:r>
     </w:p>
     <w:p>
       <w:r>
-        <w:t>performance into modData for Perception. Puker holds range, Skitter flanks,</w:t>
+        <w:t>A37 implements the opposite ownership direction for an Afflicted person who becomes Crossed. A reachable Crossed decision approaches and holds contact through an interruptible blood action. That exposure action does not itself feed; only the completed durable action can produce the existing Crossed-odds times susceptibility roll. Success transfers the same living human shell and dormant snapshot from SAO to ZAO exactly once, with retry across busy state, save/reload and later death. This closes the exposure/ownership slice; at A37, retained weapons, tools, strategy and the wider human action vocabulary were still unfinished.</w:t>
       </w:r>
     </w:p>
     <w:p>
       <w:r>
-        <w:t>and the remaining forms close on the target. The Java bridge applies per-form</w:t>
+        <w:t>A38 makes that retained human shell the Crossed person's actual communication and shared-work body. The registered ZAO execution owner reports current activity and only the capabilities the retained mind still supports. A threat can interrupt the work; accepted work can own a tick; otherwise ordinary Crossed deliberation continues. A Crossed-linked IsoZombie is rejected before all admission side effects because it is not an alternate representation of the human-looking Crossed. This is mechanically controlled, not yet observed in loaded-world play.</w:t>
       </w:r>
     </w:p>
     <w:p>
       <w:r>
-        <w:t>speed, strength, cognition, memory, sight, and hearing, and exposes the same</w:t>
+        <w:t>A39 corrects the remaining living-state ownership split. An authorized Afflicted return now enters the same durable ZAO driver a Crossed person uses; conversion changes policy without replacing the executor. Afflicted fear observed Crossed, seek actual Afflicted peers and travel to evidenced ground. They require water, prefer meat/protein, can use penalized non-dairy alternatives and may individually choose human-origin food with donor-conditioned exposure protection. Crossed retain ordinary human caloric passage, so ordinary food can sustain them. Human flesh remains preferred where sustenance, cruelty, domination, fear and contagion reinforce one another; eligible human corpses can be butchered and their origin retained through cooked dishes, but Afflicted donor provenance is categorically unavailable to Crossed feeding. Crossed blood can be deliberately prepared on an equipped melee or projectile weapon for finite native hits, while an Afflicted target still uses the separate intentional-exposure action. Target options use the actor's private observations rather than a controller-wide nearest-person scan. These are first material producers, not a closed Crossed feature list or automatic behavior loop. Borders 12 and 13 cover the mechanisms headlessly; loaded-world play remains unobserved.</w:t>
       </w:r>
     </w:p>
     <w:p>
       <w:r>
-        <w:t>ownership, form, and performance queries to Lua.</w:t>
-      </w:r>
-    </w:p>
-    <w:p/>
-    <w:p>
-      <w:r>
-        <w:t>A35/A36 also establish the durable Afflicted-return boundary with SAO. ZAO holds</w:t>
+        <w:t>A40 gives both living states durable shared matters without making their motives interchangeable. Afflicted raise and revise food or water provisioning from actual personal or settlement necessity, then withdraw it when the need resolves. Crossed raise bounded rendezvous/holding proposals to currently evidenced associates and ground. Each recipient answers from current ZAO-owned activity, capability, pressure, relationships and disposition after actual communication. Accepted work uses SAO's native acquisition, handover and locomotion owners; rendezvous completes only at the exact promised arrival. Conversion retains the process but reappraises it through current Crossed policy. Border 15 controls this combined path headlessly; loaded-world behavior remains unobserved.</w:t>
       </w:r>
     </w:p>
     <w:p>
       <w:r>
-        <w:t>the exact old source until the living destination is committed, reconstructs</w:t>
+        <w:t>A41 makes that common execution owner available without the loaded Controller. The shared adapter resolves the real retained human shell when present, exposes current ZAO.Driver activity/capability/pressure, and dispatches the final response to the current Afflicted or Crossed policy. Dormant and headless coordination therefore cannot fall back into SAO ownership. A missing shell remains an observation gap; no alternate body, mortality, migration or conversion rule is inferred. Updated Borders 11 and 15 control the shared seam; loaded-world behavior remains unobserved.</w:t>
       </w:r>
     </w:p>
     <w:p>
       <w:r>
-        <w:t>runtime controllers and courses from durable records, and uses a generation</w:t>
+        <w:t>A42 continues each state-authored matter through actual retained contacts in loaded, dormant and headless execution. Address arrival does not establish hearing; reception, private appraisal and the returned answer remain distinct. It also corrects Crossed maintenance: the retained human shell uses ordinary human caloric passage, and no reduced-calorie multiplier is applied. Crossed may use ordinary food and eligible ordinary-human provenance, but cannot feed on Afflicted. Donor identity is revalidated through raw items, evolved dishes and every timed/native action boundary; anonymous legacy human-origin food fails closed. Intentional blood exposure remains separate. Afflicted food policy is unchanged. These paths are mechanically controlled; loaded-world presentation and long-horizon ecology remain unobserved.</w:t>
       </w:r>
     </w:p>
     <w:p>
       <w:r>
-        <w:t>journal to reconcile interrupted saves across the engine's separate native and</w:t>
+        <w:t>A43 repairs native form facing and vocals and integrates detached-observer exclusion. Puker, Wrecker and Leaper windups call the installed faceThisObject(IsoObject) method, verified by reflection and production execution in Kahlua with the original invalid call as a failing control. Vocal cues use the body's native voice name through its character sound emitter; the missing body-level vocal call is a second failing control. The actor-facing ZAO.Participants.player(index) lookup excludes an engine slot marked SAO_ObserverAnchor from ZAO's player targeting, Weeper listeners, inspector and overlay. ZAO.Participants.residencyCenter() separately supplies the infrastructure coordinates used by the Controller to materialize nearby and hibernate distant living Afflicted and Crossed. The observed region can therefore host those people without admitting the observer as a participant. The Controller also honors SAO's body-recovery result: unresolved native unload retains ownership while withholding driving and materialization. Border 9 exercises the production Controller and Participants for both states and rejects four lifecycle controls, including residency and native unload. The expanded sixteen-border gate passes with no skips and exit code zero. Native workbench run 19 verifies the engine hook and separation of manual panning from region residency; it stopped and saved with zero player membership. Same-save attempt 2 has resumed cleanly from game hour 2.659274 with the same 32 people and new observation sequence 4. The reopened attempt's final stop and the broader SAO body-visibility repair remain pending. A43 closes facing/vocals, participant exclusion and residency; overall observer acceptance remains separate. Observed scenarios require operator evaluation before dataset ratification.</w:t>
       </w:r>
     </w:p>
     <w:p>
       <w:r>
-        <w:t>global persistence surfaces. This closes return ownership and reconstruction;</w:t>
+        <w:t>A44 connects both living states to SAO C89's native auditory orientation. After the common ZAO driver arbitrates current work, a personally heard fresh sound may prompt a head glance or an idle body turn. Existing physiology shapes the response; visual identification still requires actual sight. Sound cannot steer a route or displace an owned action. A44 also gives the ZAO maintenance owner a bounded rollback transaction for failed elapsed body restoration. Border 12 reuses SAO's actual policy and body-transaction instruments against current ZAO sources, preserving one test owner for the shared runtime. The unchanged sixteen-border gate passes against production SAO C89 with no skips. Loaded-world presentation and behavioral acceptance remain open.</w:t>
       </w:r>
     </w:p>
     <w:p>
       <w:r>
-        <w:t>the canonical Crossed human action system remains open in the sister roadmap.</w:t>
-      </w:r>
-    </w:p>
-    <w:p/>
-    <w:p>
-      <w:r>
-        <w:t>A37 implements the opposite ownership direction for an Afflicted person who</w:t>
+        <w:t>G0 closed at [A6]: the engine's turn surface is established from the installed build with file-and-line evidence, in F-001 through F-011. [A7] to [A9] read the mods that already run behaviour on turned bodies and set what this project does with them. G1 — one controller per body — is built: the runtime controller shipped at [A23] and drives every claimed body according to its form. Its proof by observation is owed with the era's play receipts. Two forks stand open in the ledger: Rarity (the spread's tails; how often a settlement of the turned forms) and Publication.</w:t>
       </w:r>
     </w:p>
     <w:p>
       <w:r>
-        <w:t>becomes Crossed. A reachable Crossed decision approaches and holds contact</w:t>
+        <w:t>SESSION_STATE.md holds where the work stands and ROADMAP.md holds the gate order and the open forks. This section states the tip and goes stale; those two are maintained.</w:t>
       </w:r>
     </w:p>
     <w:p>
-      <w:r>
-        <w:t>through an interruptible blood action. That exposure action does not itself</w:t>
-      </w:r>
-    </w:p>
-    <w:p>
-      <w:r>
-        <w:t>feed; only the completed durable action can produce the existing</w:t>
-      </w:r>
-    </w:p>
-    <w:p>
-      <w:r>
-        <w:t>Crossed-odds times susceptibility roll. Success transfers the same living human</w:t>
-      </w:r>
-    </w:p>
-    <w:p>
-      <w:r>
-        <w:t>shell and dormant snapshot from SAO to ZAO exactly once, with retry across busy</w:t>
-      </w:r>
-    </w:p>
-    <w:p>
-      <w:r>
-        <w:t>state, save/reload and later death. This closes the exposure/ownership slice;</w:t>
-      </w:r>
-    </w:p>
-    <w:p>
-      <w:r>
-        <w:t>at A37, retained weapons, tools, strategy and the wider human action vocabulary</w:t>
-      </w:r>
-    </w:p>
-    <w:p>
-      <w:r>
-        <w:t>were still unfinished.</w:t>
-      </w:r>
-    </w:p>
-    <w:p/>
-    <w:p>
-      <w:r>
-        <w:t>A38 makes that retained human shell the Crossed person's actual communication</w:t>
-      </w:r>
-    </w:p>
-    <w:p>
-      <w:r>
-        <w:t>and shared-work body. The registered ZAO execution owner reports current</w:t>
-      </w:r>
-    </w:p>
-    <w:p>
-      <w:r>
-        <w:t>activity and only the capabilities the retained mind still supports. A threat</w:t>
-      </w:r>
-    </w:p>
-    <w:p>
-      <w:r>
-        <w:t>can interrupt the work; accepted work can own a tick; otherwise ordinary</w:t>
-      </w:r>
-    </w:p>
-    <w:p>
-      <w:r>
-        <w:t>Crossed deliberation continues. A Crossed-linked `IsoZombie` is rejected before</w:t>
-      </w:r>
-    </w:p>
-    <w:p>
-      <w:r>
-        <w:t>all admission side effects because it is not an alternate representation of</w:t>
-      </w:r>
-    </w:p>
-    <w:p>
-      <w:r>
-        <w:t>the human-looking Crossed. This is mechanically controlled, not yet observed</w:t>
-      </w:r>
-    </w:p>
-    <w:p>
-      <w:r>
-        <w:t>in loaded-world play.</w:t>
-      </w:r>
-    </w:p>
-    <w:p/>
-    <w:p>
-      <w:r>
-        <w:t>A39 corrects the remaining living-state ownership split. An authorized</w:t>
-      </w:r>
-    </w:p>
-    <w:p>
-      <w:r>
-        <w:t>Afflicted return now enters the same durable ZAO driver a Crossed person uses;</w:t>
-      </w:r>
-    </w:p>
-    <w:p>
-      <w:r>
-        <w:t>conversion changes policy without replacing the executor. Afflicted fear</w:t>
-      </w:r>
-    </w:p>
-    <w:p>
-      <w:r>
-        <w:t>observed Crossed, seek actual Afflicted peers and travel to evidenced ground.</w:t>
-      </w:r>
-    </w:p>
-    <w:p>
-      <w:r>
-        <w:t>They require water, prefer meat/protein, can use penalized non-dairy alternatives</w:t>
-      </w:r>
-    </w:p>
-    <w:p>
-      <w:r>
-        <w:t>and may individually choose human-origin food with donor-conditioned exposure</w:t>
-      </w:r>
-    </w:p>
-    <w:p>
-      <w:r>
-        <w:t>protection. Crossed retain ordinary human caloric passage, so ordinary food can</w:t>
-      </w:r>
-    </w:p>
-    <w:p>
-      <w:r>
-        <w:t>sustain them. Human flesh remains preferred where sustenance,</w:t>
-      </w:r>
-    </w:p>
-    <w:p>
-      <w:r>
-        <w:t>cruelty, domination, fear and contagion reinforce one another; eligible human</w:t>
-      </w:r>
-    </w:p>
-    <w:p>
-      <w:r>
-        <w:t>corpses can be butchered and their origin retained through cooked dishes, but</w:t>
-      </w:r>
-    </w:p>
-    <w:p>
-      <w:r>
-        <w:t>Afflicted donor provenance is categorically unavailable to Crossed feeding.</w:t>
-      </w:r>
-    </w:p>
-    <w:p>
-      <w:r>
-        <w:t>Crossed blood can be deliberately prepared on an equipped melee or projectile</w:t>
-      </w:r>
-    </w:p>
-    <w:p>
-      <w:r>
-        <w:t>weapon for finite native hits, while an Afflicted target still uses the</w:t>
-      </w:r>
-    </w:p>
-    <w:p>
-      <w:r>
-        <w:t>separate intentional-exposure action. Target options use the actor's private</w:t>
-      </w:r>
-    </w:p>
-    <w:p>
-      <w:r>
-        <w:t>observations rather than a controller-wide nearest-person scan. These are first</w:t>
-      </w:r>
-    </w:p>
-    <w:p>
-      <w:r>
-        <w:t>material producers, not a closed Crossed feature list or automatic behavior</w:t>
-      </w:r>
-    </w:p>
-    <w:p>
-      <w:r>
-        <w:t>loop. Borders 12 and 13 cover the mechanisms headlessly; loaded-world play</w:t>
-      </w:r>
-    </w:p>
-    <w:p>
-      <w:r>
-        <w:t>remains unobserved.</w:t>
-      </w:r>
-    </w:p>
-    <w:p/>
-    <w:p>
-      <w:r>
-        <w:t>A40 gives both living states durable shared matters without making their</w:t>
-      </w:r>
-    </w:p>
-    <w:p>
-      <w:r>
-        <w:t>motives interchangeable. Afflicted raise and revise food or water provisioning</w:t>
-      </w:r>
-    </w:p>
-    <w:p>
-      <w:r>
-        <w:t>from actual personal or settlement necessity, then withdraw it when the need</w:t>
-      </w:r>
-    </w:p>
-    <w:p>
-      <w:r>
-        <w:t>resolves. Crossed raise bounded rendezvous/holding proposals to currently</w:t>
-      </w:r>
-    </w:p>
-    <w:p>
-      <w:r>
-        <w:t>evidenced associates and ground. Each recipient answers from current ZAO-owned</w:t>
-      </w:r>
-    </w:p>
-    <w:p>
-      <w:r>
-        <w:t>activity, capability, pressure, relationships and disposition after actual</w:t>
-      </w:r>
-    </w:p>
-    <w:p>
-      <w:r>
-        <w:t>communication. Accepted work uses SAO's native acquisition, handover and</w:t>
-      </w:r>
-    </w:p>
-    <w:p>
-      <w:r>
-        <w:t>locomotion owners; rendezvous completes only at the exact promised arrival.</w:t>
-      </w:r>
-    </w:p>
-    <w:p>
-      <w:r>
-        <w:t>Conversion retains the process but reappraises it through current Crossed</w:t>
-      </w:r>
-    </w:p>
-    <w:p>
-      <w:r>
-        <w:t>policy. Border 15 controls this combined path headlessly; loaded-world behavior</w:t>
-      </w:r>
-    </w:p>
-    <w:p>
-      <w:r>
-        <w:t>remains unobserved.</w:t>
-      </w:r>
-    </w:p>
-    <w:p/>
-    <w:p>
-      <w:r>
-        <w:t>A41 makes that common execution owner available without the loaded Controller.</w:t>
-      </w:r>
-    </w:p>
-    <w:p>
-      <w:r>
-        <w:t>The shared adapter resolves the real retained human shell when present, exposes</w:t>
-      </w:r>
-    </w:p>
-    <w:p>
-      <w:r>
-        <w:t>current `ZAO.Driver` activity/capability/pressure, and dispatches the final</w:t>
-      </w:r>
-    </w:p>
-    <w:p>
-      <w:r>
-        <w:t>response to the current Afflicted or Crossed policy. Dormant and headless</w:t>
-      </w:r>
-    </w:p>
-    <w:p>
-      <w:r>
-        <w:t>coordination therefore cannot fall back into SAO ownership. A missing shell</w:t>
-      </w:r>
-    </w:p>
-    <w:p>
-      <w:r>
-        <w:t>remains an observation gap; no alternate body, mortality, migration or</w:t>
-      </w:r>
-    </w:p>
-    <w:p>
-      <w:r>
-        <w:t>conversion rule is inferred. Updated Borders 11 and 15 control the shared seam;</w:t>
-      </w:r>
-    </w:p>
-    <w:p>
-      <w:r>
-        <w:t>loaded-world behavior remains unobserved.</w:t>
-      </w:r>
-    </w:p>
-    <w:p/>
-    <w:p>
-      <w:r>
-        <w:t>A42 continues each state-authored matter through actual retained contacts in</w:t>
-      </w:r>
-    </w:p>
-    <w:p>
-      <w:r>
-        <w:t>loaded, dormant and headless execution. Address arrival does not establish</w:t>
-      </w:r>
-    </w:p>
-    <w:p>
-      <w:r>
-        <w:t>hearing; reception, private appraisal and the returned answer remain distinct.</w:t>
-      </w:r>
-    </w:p>
-    <w:p>
-      <w:r>
-        <w:t>It also corrects Crossed maintenance: the retained human shell uses ordinary</w:t>
-      </w:r>
-    </w:p>
-    <w:p>
-      <w:r>
-        <w:t>human caloric passage, and no reduced-calorie multiplier is applied. Crossed</w:t>
-      </w:r>
-    </w:p>
-    <w:p>
-      <w:r>
-        <w:t>may use ordinary food and eligible ordinary-human provenance, but cannot feed</w:t>
-      </w:r>
-    </w:p>
-    <w:p>
-      <w:r>
-        <w:t>on Afflicted. Donor identity is revalidated through raw items, evolved dishes</w:t>
-      </w:r>
-    </w:p>
-    <w:p>
-      <w:r>
-        <w:t>and every timed/native action boundary; anonymous legacy human-origin food</w:t>
-      </w:r>
-    </w:p>
-    <w:p>
-      <w:r>
-        <w:t>fails closed. Intentional blood exposure remains separate. Afflicted food</w:t>
-      </w:r>
-    </w:p>
-    <w:p>
-      <w:r>
-        <w:t>policy is unchanged. These paths are mechanically controlled; loaded-world</w:t>
-      </w:r>
-    </w:p>
-    <w:p>
-      <w:r>
-        <w:t>presentation and long-horizon ecology remain unobserved.</w:t>
-      </w:r>
-    </w:p>
-    <w:p/>
-    <w:p>
-      <w:r>
-        <w:t>A43 repairs native form facing and vocals and integrates detached-observer exclusion.</w:t>
-      </w:r>
-    </w:p>
-    <w:p>
-      <w:r>
-        <w:t>Puker, Wrecker and Leaper windups call the installed</w:t>
-      </w:r>
-    </w:p>
-    <w:p>
-      <w:r>
-        <w:t>`faceThisObject(IsoObject)` method, verified by reflection and production</w:t>
-      </w:r>
-    </w:p>
-    <w:p>
-      <w:r>
-        <w:t>execution in Kahlua with the original invalid call as a failing control.</w:t>
-      </w:r>
-    </w:p>
-    <w:p>
-      <w:r>
-        <w:t>Vocal cues use the body's native voice name through its character sound emitter;</w:t>
-      </w:r>
-    </w:p>
-    <w:p>
-      <w:r>
-        <w:t>the missing body-level vocal call is a second failing control.</w:t>
-      </w:r>
-    </w:p>
-    <w:p>
-      <w:r>
-        <w:t>The actor-facing `ZAO.Participants.player(index)` lookup excludes an engine</w:t>
-      </w:r>
-    </w:p>
-    <w:p>
-      <w:r>
-        <w:t>slot marked `SAO_ObserverAnchor` from ZAO's player targeting, Weeper listeners,</w:t>
-      </w:r>
-    </w:p>
-    <w:p>
-      <w:r>
-        <w:t>inspector and overlay. `ZAO.Participants.residencyCenter()` separately supplies</w:t>
-      </w:r>
-    </w:p>
-    <w:p>
-      <w:r>
-        <w:t>the infrastructure coordinates used by the Controller to materialize nearby</w:t>
-      </w:r>
-    </w:p>
-    <w:p>
-      <w:r>
-        <w:t>and hibernate distant living Afflicted and Crossed. The observed region can</w:t>
-      </w:r>
-    </w:p>
-    <w:p>
-      <w:r>
-        <w:t>therefore host those people without admitting the observer as a participant.</w:t>
-      </w:r>
-    </w:p>
-    <w:p>
-      <w:r>
-        <w:t>The Controller also honors SAO's body-recovery result: unresolved native unload</w:t>
-      </w:r>
-    </w:p>
-    <w:p>
-      <w:r>
-        <w:t>retains ownership while withholding driving and materialization.</w:t>
-      </w:r>
-    </w:p>
-    <w:p>
-      <w:r>
-        <w:t>Border 9 exercises the production Controller and Participants for both states</w:t>
-      </w:r>
-    </w:p>
-    <w:p>
-      <w:r>
-        <w:t>and rejects four lifecycle controls, including residency and native unload.</w:t>
-      </w:r>
-    </w:p>
-    <w:p>
-      <w:r>
-        <w:t>The expanded sixteen-border gate passes with no skips and exit code zero.</w:t>
-      </w:r>
-    </w:p>
-    <w:p>
-      <w:r>
-        <w:t>Native workbench run 19</w:t>
-      </w:r>
-    </w:p>
-    <w:p>
-      <w:r>
-        <w:t>verifies the engine hook and separation of manual panning from region residency;</w:t>
-      </w:r>
-    </w:p>
-    <w:p>
-      <w:r>
-        <w:t>it stopped and saved with zero player membership. Same-save attempt 2 has</w:t>
-      </w:r>
-    </w:p>
-    <w:p>
-      <w:r>
-        <w:t>resumed cleanly from game hour 2.659274 with the same 32 people and new</w:t>
-      </w:r>
-    </w:p>
-    <w:p>
-      <w:r>
-        <w:t>observation sequence 4. The reopened attempt's final stop and the broader SAO</w:t>
-      </w:r>
-    </w:p>
-    <w:p>
-      <w:r>
-        <w:t>body-visibility repair remain pending. A43 closes facing/vocals, participant exclusion</w:t>
-      </w:r>
-    </w:p>
-    <w:p>
-      <w:r>
-        <w:t>and residency; overall observer acceptance remains separate. Observed scenarios</w:t>
-      </w:r>
-    </w:p>
-    <w:p>
-      <w:r>
-        <w:t>require operator evaluation before dataset ratification.</w:t>
-      </w:r>
-    </w:p>
-    <w:p/>
-    <w:p>
-      <w:r>
-        <w:t>G0 closed at `[A6]`: the engine's turn surface is established from the</w:t>
-      </w:r>
-    </w:p>
-    <w:p>
-      <w:r>
-        <w:t>installed build with file-and-line evidence, in F-001 through F-011.</w:t>
-      </w:r>
-    </w:p>
-    <w:p>
-      <w:r>
-        <w:t>`[A7]` to `[A9]` read the mods that already run behaviour on turned</w:t>
-      </w:r>
-    </w:p>
-    <w:p>
-      <w:r>
-        <w:t>bodies and set what this project does with them. G1 — one controller</w:t>
-      </w:r>
-    </w:p>
-    <w:p>
-      <w:r>
-        <w:t>per body — is built: the runtime controller shipped at `[A23]` and</w:t>
-      </w:r>
-    </w:p>
-    <w:p>
-      <w:r>
-        <w:t>drives every claimed body according to its form. Its proof by</w:t>
-      </w:r>
-    </w:p>
-    <w:p>
-      <w:r>
-        <w:t>observation is owed with the era's play receipts. Two forks stand open</w:t>
-      </w:r>
-    </w:p>
-    <w:p>
-      <w:r>
-        <w:t>in the ledger: Rarity (the spread's tails; how often a settlement of</w:t>
-      </w:r>
-    </w:p>
-    <w:p>
-      <w:r>
-        <w:t>the turned forms) and Publication.</w:t>
-      </w:r>
-    </w:p>
-    <w:p/>
-    <w:p>
-      <w:r>
-        <w:t>[`SESSION_STATE.md`](SESSION_STATE.md) holds where the work stands and</w:t>
-      </w:r>
-    </w:p>
-    <w:p>
-      <w:r>
-        <w:t>[`ROADMAP.md`](ROADMAP.md) holds the gate order and the open forks.</w:t>
-      </w:r>
-    </w:p>
-    <w:p>
-      <w:r>
-        <w:t>This section states the tip and goes stale; those two are maintained.</w:t>
-      </w:r>
-    </w:p>
-    <w:p/>
-    <w:p>
       <w:pPr>
-        <w:pStyle w:val="Heading2"/>
+        <w:pStyle w:val="Heading1"/>
       </w:pPr>
       <w:r>
         <w:t>Reading order</w:t>
       </w:r>
     </w:p>
-    <w:p/>
     <w:p>
       <w:r>
-        <w:t>[`NEO.md`](NEO.md) is the instruction surface. Then [`CORE.md`](CORE.md)</w:t>
+        <w:t>NEO.md is the instruction surface. Then CORE.md for identity and the two mechanisms, ARCHITECTURE.md for the ratified shape, GOVERNANCE.md for discipline, DECISION_REGISTRY.md for what is ratified and why. The gate is tools/check.sh; the version is tools/version_replay.py's output.</w:t>
       </w:r>
     </w:p>
-    <w:p>
-      <w:r>
-        <w:t>for identity and the two mechanisms, [`ARCHITECTURE.md`](ARCHITECTURE.md)</w:t>
-      </w:r>
-    </w:p>
-    <w:p>
-      <w:r>
-        <w:t>for the ratified shape, [`GOVERNANCE.md`](GOVERNANCE.md) for discipline,</w:t>
-      </w:r>
-    </w:p>
-    <w:p>
-      <w:r>
-        <w:t>[`DECISION_REGISTRY.md`](DECISION_REGISTRY.md) for what is ratified and</w:t>
-      </w:r>
-    </w:p>
-    <w:p>
-      <w:r>
-        <w:t>why. The gate is `tools/check.sh`; the version is</w:t>
-      </w:r>
-    </w:p>
-    <w:p>
-      <w:r>
-        <w:t>[`tools/version_replay.py`](tools/version_replay.py)'s output.</w:t>
-      </w:r>
-    </w:p>
-    <w:p/>
     <w:p>
       <w:r>
         <w:t>Licensed GPL-3.0.</w:t>
       </w:r>
     </w:p>
-    <w:p/>
     <w:p>
       <w:pPr>
-        <w:pStyle w:val="Heading2"/>
+        <w:pStyle w:val="Heading1"/>
       </w:pPr>
       <w:r>
         <w:t>Loading the build</w:t>
       </w:r>
     </w:p>
-    <w:p/>
     <w:p>
       <w:r>
-        <w:t>Run `tools/deploy.sh` with the game closed. In the mods list, enable</w:t>
+        <w:t>Run tools/deploy.sh with the game closed. In the mods list, enable Zombie Awareness Overhaul. Press O to open the ZAO state panel.</w:t>
       </w:r>
     </w:p>
     <w:p>
       <w:r>
-        <w:t>**Zombie Awareness Overhaul**. Press **O** to open the ZAO state panel.</w:t>
+        <w:t>With SAO enabled, the ZAO overlay also appears in the world. Every nearby body that carries a form is labelled with that form and its normalized performance. Healthy survivors are not labelled, because a body only carries a form after the pathogen has acted on it: infected, dead, or turned.</w:t>
       </w:r>
     </w:p>
-    <w:p/>
-    <w:p>
-      <w:r>
-        <w:t>With SAO enabled, the ZAO overlay also appears in the world. Every nearby</w:t>
-      </w:r>
-    </w:p>
-    <w:p>
-      <w:r>
-        <w:t>body that carries a form is labelled with that form and its normalized</w:t>
-      </w:r>
-    </w:p>
-    <w:p>
-      <w:r>
-        <w:t>performance. Healthy survivors are not labelled, because a body only carries a</w:t>
-      </w:r>
-    </w:p>
-    <w:p>
-      <w:r>
-        <w:t>form after the pathogen has acted on it: infected, dead, or turned.</w:t>
-      </w:r>
-    </w:p>
-    <w:p/>
     <w:sectPr>
+      <w:footerReference w:type="default" r:id="rId9"/>
       <w:pgSz w:w="12240" w:h="15840"/>
-      <w:pgMar w:top="1440" w:right="1800" w:bottom="1440" w:left="1800" w:header="720" w:footer="720" w:gutter="0"/>
+      <w:pgMar w:top="749" w:right="1037" w:bottom="749" w:left="1037" w:header="720" w:footer="720" w:gutter="0"/>
       <w:cols w:space="720"/>
       <w:docGrid w:linePitch="360"/>
     </w:sectPr>
   </w:body>
 </w:document>
+</file>
+
+<file path=word/footer1.xml><?xml version="1.0" encoding="utf-8"?>
+<w:ftr xmlns:m="http://schemas.openxmlformats.org/officeDocument/2006/math" xmlns:mc="http://schemas.openxmlformats.org/markup-compatibility/2006" xmlns:mo="http://schemas.microsoft.com/office/mac/office/2008/main" xmlns:mv="urn:schemas-microsoft-com:mac:vml" xmlns:o="urn:schemas-microsoft-com:office:office" xmlns:r="http://schemas.openxmlformats.org/officeDocument/2006/relationships" xmlns:v="urn:schemas-microsoft-com:vml" xmlns:w10="urn:schemas-microsoft-com:office:word" xmlns:w14="http://schemas.microsoft.com/office/word/2010/wordml" xmlns:w="http://schemas.openxmlformats.org/wordprocessingml/2006/main" xmlns:wne="http://schemas.microsoft.com/office/word/2006/wordml" xmlns:wp14="http://schemas.microsoft.com/office/word/2010/wordprocessingDrawing" xmlns:wp="http://schemas.openxmlformats.org/drawingml/2006/wordprocessingDrawing" xmlns:wpc="http://schemas.microsoft.com/office/word/2010/wordprocessingCanvas" xmlns:wpg="http://schemas.microsoft.com/office/word/2010/wordprocessingGroup" xmlns:wpi="http://schemas.microsoft.com/office/word/2010/wordprocessingInk" xmlns:wps="http://schemas.microsoft.com/office/word/2010/wordprocessingShape" mc:Ignorable="w14 wp14">
+  <w:p>
+    <w:pPr>
+      <w:pStyle w:val="Footer"/>
+      <w:jc w:val="center"/>
+    </w:pPr>
+    <w:r>
+      <w:rPr>
+        <w:sz w:val="16"/>
+      </w:rPr>
+      <w:t>Zombie Awareness Overhaul | 0.5.4.0-pre-alpha | A44</w:t>
+    </w:r>
+  </w:p>
+</w:ftr>
 </file>
 
 <file path=word/numbering.xml><?xml version="1.0" encoding="utf-8"?>
@@ -1319,6 +747,13 @@
     <w:name w:val="Normal"/>
     <w:qFormat/>
     <w:rsid w:val="00FC693F"/>
+    <w:pPr>
+      <w:spacing w:after="70"/>
+    </w:pPr>
+    <w:rPr>
+      <w:rFonts w:ascii="Aptos" w:hAnsi="Aptos"/>
+      <w:sz w:val="18"/>
+    </w:rPr>
   </w:style>
   <w:style w:type="paragraph" w:styleId="Header">
     <w:name w:val="header"/>
@@ -1379,11 +814,11 @@
       <w:outlineLvl w:val="0"/>
     </w:pPr>
     <w:rPr>
-      <w:rFonts w:asciiTheme="majorHAnsi" w:eastAsiaTheme="majorEastAsia" w:hAnsiTheme="majorHAnsi" w:cstheme="majorBidi"/>
+      <w:rFonts w:asciiTheme="majorHAnsi" w:eastAsiaTheme="majorEastAsia" w:hAnsiTheme="majorHAnsi" w:cstheme="majorBidi" w:ascii="Aptos Display" w:hAnsi="Aptos Display"/>
       <w:b/>
       <w:bCs/>
-      <w:color w:val="365F91" w:themeColor="accent1" w:themeShade="BF"/>
-      <w:sz w:val="28"/>
+      <w:color w:val="316273"/>
+      <w:sz w:val="34"/>
       <w:szCs w:val="28"/>
     </w:rPr>
   </w:style>
@@ -1403,11 +838,11 @@
       <w:outlineLvl w:val="1"/>
     </w:pPr>
     <w:rPr>
-      <w:rFonts w:asciiTheme="majorHAnsi" w:eastAsiaTheme="majorEastAsia" w:hAnsiTheme="majorHAnsi" w:cstheme="majorBidi"/>
+      <w:rFonts w:asciiTheme="majorHAnsi" w:eastAsiaTheme="majorEastAsia" w:hAnsiTheme="majorHAnsi" w:cstheme="majorBidi" w:ascii="Aptos Display" w:hAnsi="Aptos Display"/>
       <w:b/>
       <w:bCs/>
-      <w:color w:val="4F81BD" w:themeColor="accent1"/>
-      <w:sz w:val="26"/>
+      <w:color w:val="316273"/>
+      <w:sz w:val="30"/>
       <w:szCs w:val="26"/>
     </w:rPr>
   </w:style>
@@ -1427,10 +862,11 @@
       <w:outlineLvl w:val="2"/>
     </w:pPr>
     <w:rPr>
-      <w:rFonts w:asciiTheme="majorHAnsi" w:eastAsiaTheme="majorEastAsia" w:hAnsiTheme="majorHAnsi" w:cstheme="majorBidi"/>
+      <w:rFonts w:asciiTheme="majorHAnsi" w:eastAsiaTheme="majorEastAsia" w:hAnsiTheme="majorHAnsi" w:cstheme="majorBidi" w:ascii="Aptos Display" w:hAnsi="Aptos Display"/>
       <w:b/>
       <w:bCs/>
-      <w:color w:val="4F81BD" w:themeColor="accent1"/>
+      <w:color w:val="316273"/>
+      <w:sz w:val="26"/>
     </w:rPr>
   </w:style>
   <w:style w:type="paragraph" w:styleId="Heading4">
@@ -1450,12 +886,13 @@
       <w:outlineLvl w:val="3"/>
     </w:pPr>
     <w:rPr>
-      <w:rFonts w:asciiTheme="majorHAnsi" w:eastAsiaTheme="majorEastAsia" w:hAnsiTheme="majorHAnsi" w:cstheme="majorBidi"/>
+      <w:rFonts w:asciiTheme="majorHAnsi" w:eastAsiaTheme="majorEastAsia" w:hAnsiTheme="majorHAnsi" w:cstheme="majorBidi" w:ascii="Aptos Display" w:hAnsi="Aptos Display"/>
       <w:b/>
       <w:bCs/>
       <w:i/>
       <w:iCs/>
-      <w:color w:val="4F81BD" w:themeColor="accent1"/>
+      <w:color w:val="316273"/>
+      <w:sz w:val="22"/>
     </w:rPr>
   </w:style>
   <w:style w:type="paragraph" w:styleId="Heading5">

</xml_diff>

<commit_message>
[A44] source: Living orientation and elapsed rollback (#33)
</commit_message>
<xml_diff>
--- a/artifacts/docx/README.docx
+++ b/artifacts/docx/README.docx
@@ -2,236 +2,223 @@
 <file path=word/document.xml><?xml version="1.0" encoding="utf-8"?>
 <w:document xmlns:wpc="http://schemas.microsoft.com/office/word/2010/wordprocessingCanvas" xmlns:mo="http://schemas.microsoft.com/office/mac/office/2008/main" xmlns:mc="http://schemas.openxmlformats.org/markup-compatibility/2006" xmlns:mv="urn:schemas-microsoft-com:mac:vml" xmlns:o="urn:schemas-microsoft-com:office:office" xmlns:r="http://schemas.openxmlformats.org/officeDocument/2006/relationships" xmlns:m="http://schemas.openxmlformats.org/officeDocument/2006/math" xmlns:v="urn:schemas-microsoft-com:vml" xmlns:wp14="http://schemas.microsoft.com/office/word/2010/wordprocessingDrawing" xmlns:wp="http://schemas.openxmlformats.org/drawingml/2006/wordprocessingDrawing" xmlns:w10="urn:schemas-microsoft-com:office:word" xmlns:w="http://schemas.openxmlformats.org/wordprocessingml/2006/main" xmlns:w14="http://schemas.microsoft.com/office/word/2010/wordml" xmlns:wpg="http://schemas.microsoft.com/office/word/2010/wordprocessingGroup" xmlns:wpi="http://schemas.microsoft.com/office/word/2010/wordprocessingInk" xmlns:wne="http://schemas.microsoft.com/office/word/2006/wordml" xmlns:wps="http://schemas.microsoft.com/office/word/2010/wordprocessingShape" mc:Ignorable="w14 wp14">
   <w:body>
+    <w:p>
+      <w:pPr>
+        <w:jc w:val="center"/>
+      </w:pPr>
+      <w:r>
+        <w:rPr>
+          <w:rFonts w:ascii="Aptos Display" w:hAnsi="Aptos Display"/>
+          <w:b/>
+          <w:color w:val="316273"/>
+          <w:sz w:val="48"/>
+        </w:rPr>
+        <w:t>Zombie Awareness Overhaul</w:t>
+      </w:r>
+    </w:p>
     <w:tbl>
       <w:tblPr>
         <w:tblStyle w:val="TableGrid"/>
-        <w:tblW w:type="auto" w:w="0"/>
+        <w:tblW w:type="dxa" w:w="10166"/>
+        <w:jc w:val="center"/>
+        <w:tblLayout w:type="fixed"/>
         <w:tblLook w:firstColumn="1" w:firstRow="1" w:lastColumn="0" w:lastRow="0" w:noHBand="0" w:noVBand="1" w:val="04A0"/>
+        <w:tblInd w:type="dxa" w:w="120"/>
       </w:tblPr>
       <w:tblGrid>
-        <w:gridCol w:w="4320"/>
-        <w:gridCol w:w="4320"/>
+        <w:gridCol w:w="3129"/>
+        <w:gridCol w:w="7037"/>
       </w:tblGrid>
       <w:tr>
+        <w:trPr>
+          <w:cantSplit/>
+          <w:tblHeader/>
+        </w:trPr>
         <w:tc>
           <w:tcPr>
-            <w:tcW w:type="dxa" w:w="4320"/>
+            <w:tcW w:type="dxa" w:w="3129"/>
+            <w:shd w:fill="316273"/>
           </w:tcPr>
           <w:p>
             <w:r>
+              <w:rPr>
+                <w:rFonts w:ascii="Aptos" w:hAnsi="Aptos"/>
+                <w:b/>
+                <w:color w:val="FFFFFF"/>
+                <w:sz w:val="16"/>
+              </w:rPr>
               <w:t>Document</w:t>
             </w:r>
           </w:p>
         </w:tc>
         <w:tc>
           <w:tcPr>
-            <w:tcW w:type="dxa" w:w="4320"/>
+            <w:tcW w:type="dxa" w:w="7037"/>
+            <w:shd w:fill="316273"/>
           </w:tcPr>
           <w:p>
             <w:r>
+              <w:rPr>
+                <w:rFonts w:ascii="Aptos" w:hAnsi="Aptos"/>
+                <w:b/>
+                <w:color w:val="FFFFFF"/>
+                <w:sz w:val="16"/>
+              </w:rPr>
               <w:t>Zombie Awareness Overhaul</w:t>
             </w:r>
           </w:p>
         </w:tc>
       </w:tr>
       <w:tr>
+        <w:trPr>
+          <w:cantSplit/>
+        </w:trPr>
         <w:tc>
           <w:tcPr>
-            <w:tcW w:type="dxa" w:w="4320"/>
+            <w:tcW w:type="dxa" w:w="3129"/>
           </w:tcPr>
           <w:p>
             <w:r>
+              <w:rPr>
+                <w:rFonts w:ascii="Aptos" w:hAnsi="Aptos"/>
+                <w:sz w:val="16"/>
+              </w:rPr>
               <w:t>Version</w:t>
             </w:r>
           </w:p>
         </w:tc>
         <w:tc>
           <w:tcPr>
-            <w:tcW w:type="dxa" w:w="4320"/>
+            <w:tcW w:type="dxa" w:w="7037"/>
           </w:tcPr>
           <w:p>
             <w:r>
-              <w:t>`0.5.3.0-pre-alpha`</w:t>
+              <w:rPr>
+                <w:rFonts w:ascii="Aptos" w:hAnsi="Aptos"/>
+                <w:sz w:val="16"/>
+              </w:rPr>
+              <w:t>0.5.4.0-pre-alpha</w:t>
             </w:r>
           </w:p>
         </w:tc>
       </w:tr>
       <w:tr>
+        <w:trPr>
+          <w:cantSplit/>
+        </w:trPr>
         <w:tc>
           <w:tcPr>
-            <w:tcW w:type="dxa" w:w="4320"/>
+            <w:tcW w:type="dxa" w:w="3129"/>
+            <w:shd w:fill="EAF1F3"/>
           </w:tcPr>
           <w:p>
             <w:r>
+              <w:rPr>
+                <w:rFonts w:ascii="Aptos" w:hAnsi="Aptos"/>
+                <w:sz w:val="16"/>
+              </w:rPr>
               <w:t>Author</w:t>
             </w:r>
           </w:p>
         </w:tc>
         <w:tc>
           <w:tcPr>
-            <w:tcW w:type="dxa" w:w="4320"/>
+            <w:tcW w:type="dxa" w:w="7037"/>
+            <w:shd w:fill="EAF1F3"/>
           </w:tcPr>
           <w:p>
             <w:r>
+              <w:rPr>
+                <w:rFonts w:ascii="Aptos" w:hAnsi="Aptos"/>
+                <w:sz w:val="16"/>
+              </w:rPr>
               <w:t>ellyj3rain</w:t>
             </w:r>
           </w:p>
         </w:tc>
       </w:tr>
       <w:tr>
+        <w:trPr>
+          <w:cantSplit/>
+        </w:trPr>
         <w:tc>
           <w:tcPr>
-            <w:tcW w:type="dxa" w:w="4320"/>
+            <w:tcW w:type="dxa" w:w="3129"/>
           </w:tcPr>
           <w:p>
             <w:r>
+              <w:rPr>
+                <w:rFonts w:ascii="Aptos" w:hAnsi="Aptos"/>
+                <w:sz w:val="16"/>
+              </w:rPr>
               <w:t>Repository</w:t>
             </w:r>
           </w:p>
         </w:tc>
         <w:tc>
           <w:tcPr>
-            <w:tcW w:type="dxa" w:w="4320"/>
+            <w:tcW w:type="dxa" w:w="7037"/>
           </w:tcPr>
           <w:p>
             <w:r>
-              <w:t>`README.md`</w:t>
+              <w:rPr>
+                <w:rFonts w:ascii="Aptos" w:hAnsi="Aptos"/>
+                <w:sz w:val="16"/>
+              </w:rPr>
+              <w:t>README.md</w:t>
             </w:r>
           </w:p>
         </w:tc>
       </w:tr>
       <w:tr>
+        <w:trPr>
+          <w:cantSplit/>
+        </w:trPr>
         <w:tc>
           <w:tcPr>
-            <w:tcW w:type="dxa" w:w="4320"/>
+            <w:tcW w:type="dxa" w:w="3129"/>
+            <w:shd w:fill="EAF1F3"/>
           </w:tcPr>
           <w:p>
             <w:r>
+              <w:rPr>
+                <w:rFonts w:ascii="Aptos" w:hAnsi="Aptos"/>
+                <w:sz w:val="16"/>
+              </w:rPr>
               <w:t>Status</w:t>
             </w:r>
           </w:p>
         </w:tc>
         <w:tc>
           <w:tcPr>
-            <w:tcW w:type="dxa" w:w="4320"/>
+            <w:tcW w:type="dxa" w:w="7037"/>
+            <w:shd w:fill="EAF1F3"/>
           </w:tcPr>
           <w:p>
             <w:r>
+              <w:rPr>
+                <w:rFonts w:ascii="Aptos" w:hAnsi="Aptos"/>
+                <w:sz w:val="16"/>
+              </w:rPr>
               <w:t>CANONICAL - human entry point.</w:t>
             </w:r>
           </w:p>
         </w:tc>
       </w:tr>
     </w:tbl>
-    <w:p/>
-    <w:p>
-      <w:pPr>
-        <w:pStyle w:val="Heading1"/>
-      </w:pPr>
-      <w:r>
-        <w:t>Zombie Awareness Overhaul</w:t>
-      </w:r>
-    </w:p>
-    <w:p/>
     <w:p>
       <w:r>
-        <w:t>A Project Zomboid Build 42 add-on beside [Survivor Awareness</w:t>
+        <w:t>A Project Zomboid Build 42 add-on beside Survivor Awareness Overhaul. SAO executes ordinary living survivors and provides county services. ZAO executes turned bodies and the living Afflicted and Crossed states its pathogen creates. With ZAO disabled, vanilla handles every corpse and those ZAO living states are not produced.</w:t>
       </w:r>
     </w:p>
     <w:p>
       <w:r>
-        <w:t>Overhaul](../survivor-awareness). SAO executes ordinary living survivors and</w:t>
+        <w:t>The architecture across the three repositories - what SAO, ZAO and Speakeasy each own, and the three seams between them - is held in ../survivor-awareness/PROJECTS.md, which is PROJECTS.md on the forge. The relative path is for a reader with the three repositories side by side, which is how they are worked on; the link is for a reader who has only this one.</w:t>
       </w:r>
     </w:p>
     <w:p>
       <w:r>
-        <w:t>provides county services. ZAO executes turned bodies and the living Afflicted</w:t>
-      </w:r>
-    </w:p>
-    <w:p>
-      <w:r>
-        <w:t>and Crossed states its pathogen creates. With ZAO disabled, vanilla handles</w:t>
-      </w:r>
-    </w:p>
-    <w:p>
-      <w:r>
-        <w:t>every corpse and those ZAO living states are not produced.</w:t>
-      </w:r>
-    </w:p>
-    <w:p/>
-    <w:p>
-      <w:r>
-        <w:t>The architecture across the three repositories - what SAO, ZAO and</w:t>
-      </w:r>
-    </w:p>
-    <w:p>
-      <w:r>
-        <w:t>[Speakeasy](../zomboid-speakeasy) each own, and the three seams between</w:t>
-      </w:r>
-    </w:p>
-    <w:p>
-      <w:r>
-        <w:t>them - is held in `../survivor-awareness/PROJECTS.md`, which is</w:t>
-      </w:r>
-    </w:p>
-    <w:p>
-      <w:r>
-        <w:t>[`PROJECTS.md`](https://github.com/ellyj3rain/sao/blob/main/PROJECTS.md)</w:t>
-      </w:r>
-    </w:p>
-    <w:p>
-      <w:r>
-        <w:t>on the forge. The relative path is for a reader with the three</w:t>
-      </w:r>
-    </w:p>
-    <w:p>
-      <w:r>
-        <w:t>repositories side by side, which is how they are worked on; the link</w:t>
-      </w:r>
-    </w:p>
-    <w:p>
-      <w:r>
-        <w:t>is for a reader who has only this one.</w:t>
-      </w:r>
-    </w:p>
-    <w:p/>
-    <w:p>
-      <w:r>
         <w:t>Two mechanisms, litigated separately and never merged:</w:t>
-      </w:r>
-    </w:p>
-    <w:p/>
-    <w:p>
-      <w:pPr>
-        <w:pStyle w:val="ListBullet"/>
-      </w:pPr>
-      <w:r>
-        <w:t>**Zombie intelligence** — modeled decay and neurodegeneration. A turned</w:t>
-      </w:r>
-    </w:p>
-    <w:p>
-      <w:r>
-        <w:t xml:space="preserve">  body acts on its person's own SAO record as that record degrades. It</w:t>
-      </w:r>
-    </w:p>
-    <w:p>
-      <w:r>
-        <w:t xml:space="preserve">  retains what they had perceived and the actions they could perform, and</w:t>
-      </w:r>
-    </w:p>
-    <w:p>
-      <w:r>
-        <w:t xml:space="preserve">  loses both over time at a rate that differs per body. Groups of the</w:t>
-      </w:r>
-    </w:p>
-    <w:p>
-      <w:r>
-        <w:t xml:space="preserve">  turned can form settlements the way living survivors do. That is rare by</w:t>
-      </w:r>
-    </w:p>
-    <w:p>
-      <w:r>
-        <w:t xml:space="preserve">  design and is built complete rather than stubbed.</w:t>
       </w:r>
     </w:p>
     <w:p>
@@ -239,721 +226,162 @@
         <w:pStyle w:val="ListBullet"/>
       </w:pPr>
       <w:r>
-        <w:t>**Decay and mutation** — the pathogen's own mechanics, on two ledgers:</w:t>
+        <w:t>Zombie intelligence — modeled decay and neurodegeneration. A turned</w:t>
       </w:r>
     </w:p>
     <w:p>
       <w:r>
-        <w:t xml:space="preserve">  what Knox does to bodies through which routes, and what anyone is</w:t>
+        <w:t>body acts on its person's own SAO record as that record degrades. It retains what they had perceived and the actions they could perform, and loses both over time at a rate that differs per body. Groups of the turned can form settlements the way living survivors do. That is rare by design and is built complete rather than stubbed.</w:t>
+      </w:r>
+    </w:p>
+    <w:p>
+      <w:pPr>
+        <w:pStyle w:val="ListBullet"/>
+      </w:pPr>
+      <w:r>
+        <w:t>Decay and mutation — the pathogen's own mechanics, on two ledgers:</w:t>
       </w:r>
     </w:p>
     <w:p>
       <w:r>
-        <w:t xml:space="preserve">  permitted to know about it. No capability here requires another mod to</w:t>
+        <w:t>what Knox does to bodies through which routes, and what anyone is permitted to know about it. No capability here requires another mod to be installed. Mutation moves on separate axes whose definition is reserved to the operator.</w:t>
       </w:r>
     </w:p>
     <w:p>
-      <w:r>
-        <w:t xml:space="preserve">  be installed. Mutation moves on separate axes whose definition is</w:t>
-      </w:r>
-    </w:p>
-    <w:p>
-      <w:r>
-        <w:t xml:space="preserve">  reserved to the operator.</w:t>
-      </w:r>
-    </w:p>
-    <w:p/>
-    <w:p>
       <w:pPr>
-        <w:pStyle w:val="Heading2"/>
+        <w:pStyle w:val="Heading1"/>
       </w:pPr>
       <w:r>
         <w:t>Status</w:t>
       </w:r>
     </w:p>
-    <w:p/>
     <w:p>
       <w:r>
         <w:t>ZAO now ships a complete mod tree.</w:t>
       </w:r>
     </w:p>
-    <w:p/>
     <w:p>
       <w:r>
-        <w:t>The runtime controller claims every valid turned zombie that carries</w:t>
+        <w:t>The runtime controller claims every valid turned zombie that carries SAOPersonId, drives it according to its form, and writes the form and performance into modData for Perception. Puker holds range, Skitter flanks, and the remaining forms close on the target. The Java bridge applies per-form speed, strength, cognition, memory, sight, and hearing, and exposes the same ownership, form, and performance queries to Lua.</w:t>
       </w:r>
     </w:p>
     <w:p>
       <w:r>
-        <w:t>`SAOPersonId`, drives it according to its form, and writes the form and</w:t>
+        <w:t>A35/A36 also establish the durable Afflicted-return boundary with SAO. ZAO holds the exact old source until the living destination is committed, reconstructs runtime controllers and courses from durable records, and uses a generation journal to reconcile interrupted saves across the engine's separate native and global persistence surfaces. This closes return ownership and reconstruction; the canonical Crossed human action system remains open in the sister roadmap.</w:t>
       </w:r>
     </w:p>
     <w:p>
       <w:r>
-        <w:t>performance into modData for Perception. Puker holds range, Skitter flanks,</w:t>
+        <w:t>A37 implements the opposite ownership direction for an Afflicted person who becomes Crossed. A reachable Crossed decision approaches and holds contact through an interruptible blood action. That exposure action does not itself feed; only the completed durable action can produce the existing Crossed-odds times susceptibility roll. Success transfers the same living human shell and dormant snapshot from SAO to ZAO exactly once, with retry across busy state, save/reload and later death. This closes the exposure/ownership slice; at A37, retained weapons, tools, strategy and the wider human action vocabulary were still unfinished.</w:t>
       </w:r>
     </w:p>
     <w:p>
       <w:r>
-        <w:t>and the remaining forms close on the target. The Java bridge applies per-form</w:t>
+        <w:t>A38 makes that retained human shell the Crossed person's actual communication and shared-work body. The registered ZAO execution owner reports current activity and only the capabilities the retained mind still supports. A threat can interrupt the work; accepted work can own a tick; otherwise ordinary Crossed deliberation continues. A Crossed-linked IsoZombie is rejected before all admission side effects because it is not an alternate representation of the human-looking Crossed. This is mechanically controlled, not yet observed in loaded-world play.</w:t>
       </w:r>
     </w:p>
     <w:p>
       <w:r>
-        <w:t>speed, strength, cognition, memory, sight, and hearing, and exposes the same</w:t>
+        <w:t>A39 corrects the remaining living-state ownership split. An authorized Afflicted return now enters the same durable ZAO driver a Crossed person uses; conversion changes policy without replacing the executor. Afflicted fear observed Crossed, seek actual Afflicted peers and travel to evidenced ground. They require water, prefer meat/protein, can use penalized non-dairy alternatives and may individually choose human-origin food with donor-conditioned exposure protection. Crossed retain ordinary human caloric passage, so ordinary food can sustain them. Human flesh remains preferred where sustenance, cruelty, domination, fear and contagion reinforce one another; eligible human corpses can be butchered and their origin retained through cooked dishes, but Afflicted donor provenance is categorically unavailable to Crossed feeding. Crossed blood can be deliberately prepared on an equipped melee or projectile weapon for finite native hits, while an Afflicted target still uses the separate intentional-exposure action. Target options use the actor's private observations rather than a controller-wide nearest-person scan. These are first material producers, not a closed Crossed feature list or automatic behavior loop. Borders 12 and 13 cover the mechanisms headlessly; loaded-world play remains unobserved.</w:t>
       </w:r>
     </w:p>
     <w:p>
       <w:r>
-        <w:t>ownership, form, and performance queries to Lua.</w:t>
-      </w:r>
-    </w:p>
-    <w:p/>
-    <w:p>
-      <w:r>
-        <w:t>A35/A36 also establish the durable Afflicted-return boundary with SAO. ZAO holds</w:t>
+        <w:t>A40 gives both living states durable shared matters without making their motives interchangeable. Afflicted raise and revise food or water provisioning from actual personal or settlement necessity, then withdraw it when the need resolves. Crossed raise bounded rendezvous/holding proposals to currently evidenced associates and ground. Each recipient answers from current ZAO-owned activity, capability, pressure, relationships and disposition after actual communication. Accepted work uses SAO's native acquisition, handover and locomotion owners; rendezvous completes only at the exact promised arrival. Conversion retains the process but reappraises it through current Crossed policy. Border 15 controls this combined path headlessly; loaded-world behavior remains unobserved.</w:t>
       </w:r>
     </w:p>
     <w:p>
       <w:r>
-        <w:t>the exact old source until the living destination is committed, reconstructs</w:t>
+        <w:t>A41 makes that common execution owner available without the loaded Controller. The shared adapter resolves the real retained human shell when present, exposes current ZAO.Driver activity/capability/pressure, and dispatches the final response to the current Afflicted or Crossed policy. Dormant and headless coordination therefore cannot fall back into SAO ownership. A missing shell remains an observation gap; no alternate body, mortality, migration or conversion rule is inferred. Updated Borders 11 and 15 control the shared seam; loaded-world behavior remains unobserved.</w:t>
       </w:r>
     </w:p>
     <w:p>
       <w:r>
-        <w:t>runtime controllers and courses from durable records, and uses a generation</w:t>
+        <w:t>A42 continues each state-authored matter through actual retained contacts in loaded, dormant and headless execution. Address arrival does not establish hearing; reception, private appraisal and the returned answer remain distinct. It also corrects Crossed maintenance: the retained human shell uses ordinary human caloric passage, and no reduced-calorie multiplier is applied. Crossed may use ordinary food and eligible ordinary-human provenance, but cannot feed on Afflicted. Donor identity is revalidated through raw items, evolved dishes and every timed/native action boundary; anonymous legacy human-origin food fails closed. Intentional blood exposure remains separate. Afflicted food policy is unchanged. These paths are mechanically controlled; loaded-world presentation and long-horizon ecology remain unobserved.</w:t>
       </w:r>
     </w:p>
     <w:p>
       <w:r>
-        <w:t>journal to reconcile interrupted saves across the engine's separate native and</w:t>
+        <w:t>A43 repairs native form facing and vocals and integrates detached-observer exclusion. Puker, Wrecker and Leaper windups call the installed faceThisObject(IsoObject) method, verified by reflection and production execution in Kahlua with the original invalid call as a failing control. Vocal cues use the body's native voice name through its character sound emitter; the missing body-level vocal call is a second failing control. The actor-facing ZAO.Participants.player(index) lookup excludes an engine slot marked SAO_ObserverAnchor from ZAO's player targeting, Weeper listeners, inspector and overlay. ZAO.Participants.residencyCenter() separately supplies the infrastructure coordinates used by the Controller to materialize nearby and hibernate distant living Afflicted and Crossed. The observed region can therefore host those people without admitting the observer as a participant. The Controller also honors SAO's body-recovery result: unresolved native unload retains ownership while withholding driving and materialization. Border 9 exercises the production Controller and Participants for both states and rejects four lifecycle controls, including residency and native unload. The expanded sixteen-border gate passes with no skips and exit code zero. Native workbench run 19 verifies the engine hook and separation of manual panning from region residency; it stopped and saved with zero player membership. Same-save attempt 2 has resumed cleanly from game hour 2.659274 with the same 32 people and new observation sequence 4. The reopened attempt's final stop and the broader SAO body-visibility repair remain pending. A43 closes facing/vocals, participant exclusion and residency; overall observer acceptance remains separate. Observed scenarios require operator evaluation before dataset ratification.</w:t>
       </w:r>
     </w:p>
     <w:p>
       <w:r>
-        <w:t>global persistence surfaces. This closes return ownership and reconstruction;</w:t>
+        <w:t>A44 connects both living states to SAO C89's native auditory orientation. After the common ZAO driver arbitrates current work, a personally heard fresh sound may prompt a head glance or an idle body turn. Existing physiology shapes the response; visual identification still requires actual sight. Sound cannot steer a route or displace an owned action. A44 also gives the ZAO maintenance owner a bounded rollback transaction for failed elapsed body restoration. Border 12 reuses SAO's actual policy and body-transaction instruments against current ZAO sources, preserving one test owner for the shared runtime. The unchanged sixteen-border gate passes against production SAO C89 with no skips. Loaded-world presentation and behavioral acceptance remain open.</w:t>
       </w:r>
     </w:p>
     <w:p>
       <w:r>
-        <w:t>the canonical Crossed human action system remains open in the sister roadmap.</w:t>
-      </w:r>
-    </w:p>
-    <w:p/>
-    <w:p>
-      <w:r>
-        <w:t>A37 implements the opposite ownership direction for an Afflicted person who</w:t>
+        <w:t>G0 closed at [A6]: the engine's turn surface is established from the installed build with file-and-line evidence, in F-001 through F-011. [A7] to [A9] read the mods that already run behaviour on turned bodies and set what this project does with them. G1 — one controller per body — is built: the runtime controller shipped at [A23] and drives every claimed body according to its form. Its proof by observation is owed with the era's play receipts. Two forks stand open in the ledger: Rarity (the spread's tails; how often a settlement of the turned forms) and Publication.</w:t>
       </w:r>
     </w:p>
     <w:p>
       <w:r>
-        <w:t>becomes Crossed. A reachable Crossed decision approaches and holds contact</w:t>
+        <w:t>SESSION_STATE.md holds where the work stands and ROADMAP.md holds the gate order and the open forks. This section states the tip and goes stale; those two are maintained.</w:t>
       </w:r>
     </w:p>
     <w:p>
-      <w:r>
-        <w:t>through an interruptible blood action. That exposure action does not itself</w:t>
-      </w:r>
-    </w:p>
-    <w:p>
-      <w:r>
-        <w:t>feed; only the completed durable action can produce the existing</w:t>
-      </w:r>
-    </w:p>
-    <w:p>
-      <w:r>
-        <w:t>Crossed-odds times susceptibility roll. Success transfers the same living human</w:t>
-      </w:r>
-    </w:p>
-    <w:p>
-      <w:r>
-        <w:t>shell and dormant snapshot from SAO to ZAO exactly once, with retry across busy</w:t>
-      </w:r>
-    </w:p>
-    <w:p>
-      <w:r>
-        <w:t>state, save/reload and later death. This closes the exposure/ownership slice;</w:t>
-      </w:r>
-    </w:p>
-    <w:p>
-      <w:r>
-        <w:t>at A37, retained weapons, tools, strategy and the wider human action vocabulary</w:t>
-      </w:r>
-    </w:p>
-    <w:p>
-      <w:r>
-        <w:t>were still unfinished.</w:t>
-      </w:r>
-    </w:p>
-    <w:p/>
-    <w:p>
-      <w:r>
-        <w:t>A38 makes that retained human shell the Crossed person's actual communication</w:t>
-      </w:r>
-    </w:p>
-    <w:p>
-      <w:r>
-        <w:t>and shared-work body. The registered ZAO execution owner reports current</w:t>
-      </w:r>
-    </w:p>
-    <w:p>
-      <w:r>
-        <w:t>activity and only the capabilities the retained mind still supports. A threat</w:t>
-      </w:r>
-    </w:p>
-    <w:p>
-      <w:r>
-        <w:t>can interrupt the work; accepted work can own a tick; otherwise ordinary</w:t>
-      </w:r>
-    </w:p>
-    <w:p>
-      <w:r>
-        <w:t>Crossed deliberation continues. A Crossed-linked `IsoZombie` is rejected before</w:t>
-      </w:r>
-    </w:p>
-    <w:p>
-      <w:r>
-        <w:t>all admission side effects because it is not an alternate representation of</w:t>
-      </w:r>
-    </w:p>
-    <w:p>
-      <w:r>
-        <w:t>the human-looking Crossed. This is mechanically controlled, not yet observed</w:t>
-      </w:r>
-    </w:p>
-    <w:p>
-      <w:r>
-        <w:t>in loaded-world play.</w:t>
-      </w:r>
-    </w:p>
-    <w:p/>
-    <w:p>
-      <w:r>
-        <w:t>A39 corrects the remaining living-state ownership split. An authorized</w:t>
-      </w:r>
-    </w:p>
-    <w:p>
-      <w:r>
-        <w:t>Afflicted return now enters the same durable ZAO driver a Crossed person uses;</w:t>
-      </w:r>
-    </w:p>
-    <w:p>
-      <w:r>
-        <w:t>conversion changes policy without replacing the executor. Afflicted fear</w:t>
-      </w:r>
-    </w:p>
-    <w:p>
-      <w:r>
-        <w:t>observed Crossed, seek actual Afflicted peers and travel to evidenced ground.</w:t>
-      </w:r>
-    </w:p>
-    <w:p>
-      <w:r>
-        <w:t>They require water, prefer meat/protein, can use penalized non-dairy alternatives</w:t>
-      </w:r>
-    </w:p>
-    <w:p>
-      <w:r>
-        <w:t>and may individually choose human-origin food with donor-conditioned exposure</w:t>
-      </w:r>
-    </w:p>
-    <w:p>
-      <w:r>
-        <w:t>protection. Crossed retain ordinary human caloric passage, so ordinary food can</w:t>
-      </w:r>
-    </w:p>
-    <w:p>
-      <w:r>
-        <w:t>sustain them. Human flesh remains preferred where sustenance,</w:t>
-      </w:r>
-    </w:p>
-    <w:p>
-      <w:r>
-        <w:t>cruelty, domination, fear and contagion reinforce one another; eligible human</w:t>
-      </w:r>
-    </w:p>
-    <w:p>
-      <w:r>
-        <w:t>corpses can be butchered and their origin retained through cooked dishes, but</w:t>
-      </w:r>
-    </w:p>
-    <w:p>
-      <w:r>
-        <w:t>Afflicted donor provenance is categorically unavailable to Crossed feeding.</w:t>
-      </w:r>
-    </w:p>
-    <w:p>
-      <w:r>
-        <w:t>Crossed blood can be deliberately prepared on an equipped melee or projectile</w:t>
-      </w:r>
-    </w:p>
-    <w:p>
-      <w:r>
-        <w:t>weapon for finite native hits, while an Afflicted target still uses the</w:t>
-      </w:r>
-    </w:p>
-    <w:p>
-      <w:r>
-        <w:t>separate intentional-exposure action. Target options use the actor's private</w:t>
-      </w:r>
-    </w:p>
-    <w:p>
-      <w:r>
-        <w:t>observations rather than a controller-wide nearest-person scan. These are first</w:t>
-      </w:r>
-    </w:p>
-    <w:p>
-      <w:r>
-        <w:t>material producers, not a closed Crossed feature list or automatic behavior</w:t>
-      </w:r>
-    </w:p>
-    <w:p>
-      <w:r>
-        <w:t>loop. Borders 12 and 13 cover the mechanisms headlessly; loaded-world play</w:t>
-      </w:r>
-    </w:p>
-    <w:p>
-      <w:r>
-        <w:t>remains unobserved.</w:t>
-      </w:r>
-    </w:p>
-    <w:p/>
-    <w:p>
-      <w:r>
-        <w:t>A40 gives both living states durable shared matters without making their</w:t>
-      </w:r>
-    </w:p>
-    <w:p>
-      <w:r>
-        <w:t>motives interchangeable. Afflicted raise and revise food or water provisioning</w:t>
-      </w:r>
-    </w:p>
-    <w:p>
-      <w:r>
-        <w:t>from actual personal or settlement necessity, then withdraw it when the need</w:t>
-      </w:r>
-    </w:p>
-    <w:p>
-      <w:r>
-        <w:t>resolves. Crossed raise bounded rendezvous/holding proposals to currently</w:t>
-      </w:r>
-    </w:p>
-    <w:p>
-      <w:r>
-        <w:t>evidenced associates and ground. Each recipient answers from current ZAO-owned</w:t>
-      </w:r>
-    </w:p>
-    <w:p>
-      <w:r>
-        <w:t>activity, capability, pressure, relationships and disposition after actual</w:t>
-      </w:r>
-    </w:p>
-    <w:p>
-      <w:r>
-        <w:t>communication. Accepted work uses SAO's native acquisition, handover and</w:t>
-      </w:r>
-    </w:p>
-    <w:p>
-      <w:r>
-        <w:t>locomotion owners; rendezvous completes only at the exact promised arrival.</w:t>
-      </w:r>
-    </w:p>
-    <w:p>
-      <w:r>
-        <w:t>Conversion retains the process but reappraises it through current Crossed</w:t>
-      </w:r>
-    </w:p>
-    <w:p>
-      <w:r>
-        <w:t>policy. Border 15 controls this combined path headlessly; loaded-world behavior</w:t>
-      </w:r>
-    </w:p>
-    <w:p>
-      <w:r>
-        <w:t>remains unobserved.</w:t>
-      </w:r>
-    </w:p>
-    <w:p/>
-    <w:p>
-      <w:r>
-        <w:t>A41 makes that common execution owner available without the loaded Controller.</w:t>
-      </w:r>
-    </w:p>
-    <w:p>
-      <w:r>
-        <w:t>The shared adapter resolves the real retained human shell when present, exposes</w:t>
-      </w:r>
-    </w:p>
-    <w:p>
-      <w:r>
-        <w:t>current `ZAO.Driver` activity/capability/pressure, and dispatches the final</w:t>
-      </w:r>
-    </w:p>
-    <w:p>
-      <w:r>
-        <w:t>response to the current Afflicted or Crossed policy. Dormant and headless</w:t>
-      </w:r>
-    </w:p>
-    <w:p>
-      <w:r>
-        <w:t>coordination therefore cannot fall back into SAO ownership. A missing shell</w:t>
-      </w:r>
-    </w:p>
-    <w:p>
-      <w:r>
-        <w:t>remains an observation gap; no alternate body, mortality, migration or</w:t>
-      </w:r>
-    </w:p>
-    <w:p>
-      <w:r>
-        <w:t>conversion rule is inferred. Updated Borders 11 and 15 control the shared seam;</w:t>
-      </w:r>
-    </w:p>
-    <w:p>
-      <w:r>
-        <w:t>loaded-world behavior remains unobserved.</w:t>
-      </w:r>
-    </w:p>
-    <w:p/>
-    <w:p>
-      <w:r>
-        <w:t>A42 continues each state-authored matter through actual retained contacts in</w:t>
-      </w:r>
-    </w:p>
-    <w:p>
-      <w:r>
-        <w:t>loaded, dormant and headless execution. Address arrival does not establish</w:t>
-      </w:r>
-    </w:p>
-    <w:p>
-      <w:r>
-        <w:t>hearing; reception, private appraisal and the returned answer remain distinct.</w:t>
-      </w:r>
-    </w:p>
-    <w:p>
-      <w:r>
-        <w:t>It also corrects Crossed maintenance: the retained human shell uses ordinary</w:t>
-      </w:r>
-    </w:p>
-    <w:p>
-      <w:r>
-        <w:t>human caloric passage, and no reduced-calorie multiplier is applied. Crossed</w:t>
-      </w:r>
-    </w:p>
-    <w:p>
-      <w:r>
-        <w:t>may use ordinary food and eligible ordinary-human provenance, but cannot feed</w:t>
-      </w:r>
-    </w:p>
-    <w:p>
-      <w:r>
-        <w:t>on Afflicted. Donor identity is revalidated through raw items, evolved dishes</w:t>
-      </w:r>
-    </w:p>
-    <w:p>
-      <w:r>
-        <w:t>and every timed/native action boundary; anonymous legacy human-origin food</w:t>
-      </w:r>
-    </w:p>
-    <w:p>
-      <w:r>
-        <w:t>fails closed. Intentional blood exposure remains separate. Afflicted food</w:t>
-      </w:r>
-    </w:p>
-    <w:p>
-      <w:r>
-        <w:t>policy is unchanged. These paths are mechanically controlled; loaded-world</w:t>
-      </w:r>
-    </w:p>
-    <w:p>
-      <w:r>
-        <w:t>presentation and long-horizon ecology remain unobserved.</w:t>
-      </w:r>
-    </w:p>
-    <w:p/>
-    <w:p>
-      <w:r>
-        <w:t>A43 repairs native form facing and vocals and integrates detached-observer exclusion.</w:t>
-      </w:r>
-    </w:p>
-    <w:p>
-      <w:r>
-        <w:t>Puker, Wrecker and Leaper windups call the installed</w:t>
-      </w:r>
-    </w:p>
-    <w:p>
-      <w:r>
-        <w:t>`faceThisObject(IsoObject)` method, verified by reflection and production</w:t>
-      </w:r>
-    </w:p>
-    <w:p>
-      <w:r>
-        <w:t>execution in Kahlua with the original invalid call as a failing control.</w:t>
-      </w:r>
-    </w:p>
-    <w:p>
-      <w:r>
-        <w:t>Vocal cues use the body's native voice name through its character sound emitter;</w:t>
-      </w:r>
-    </w:p>
-    <w:p>
-      <w:r>
-        <w:t>the missing body-level vocal call is a second failing control.</w:t>
-      </w:r>
-    </w:p>
-    <w:p>
-      <w:r>
-        <w:t>The actor-facing `ZAO.Participants.player(index)` lookup excludes an engine</w:t>
-      </w:r>
-    </w:p>
-    <w:p>
-      <w:r>
-        <w:t>slot marked `SAO_ObserverAnchor` from ZAO's player targeting, Weeper listeners,</w:t>
-      </w:r>
-    </w:p>
-    <w:p>
-      <w:r>
-        <w:t>inspector and overlay. `ZAO.Participants.residencyCenter()` separately supplies</w:t>
-      </w:r>
-    </w:p>
-    <w:p>
-      <w:r>
-        <w:t>the infrastructure coordinates used by the Controller to materialize nearby</w:t>
-      </w:r>
-    </w:p>
-    <w:p>
-      <w:r>
-        <w:t>and hibernate distant living Afflicted and Crossed. The observed region can</w:t>
-      </w:r>
-    </w:p>
-    <w:p>
-      <w:r>
-        <w:t>therefore host those people without admitting the observer as a participant.</w:t>
-      </w:r>
-    </w:p>
-    <w:p>
-      <w:r>
-        <w:t>The Controller also honors SAO's body-recovery result: unresolved native unload</w:t>
-      </w:r>
-    </w:p>
-    <w:p>
-      <w:r>
-        <w:t>retains ownership while withholding driving and materialization.</w:t>
-      </w:r>
-    </w:p>
-    <w:p>
-      <w:r>
-        <w:t>Border 9 exercises the production Controller and Participants for both states</w:t>
-      </w:r>
-    </w:p>
-    <w:p>
-      <w:r>
-        <w:t>and rejects four lifecycle controls, including residency and native unload.</w:t>
-      </w:r>
-    </w:p>
-    <w:p>
-      <w:r>
-        <w:t>The expanded sixteen-border gate passes with no skips and exit code zero.</w:t>
-      </w:r>
-    </w:p>
-    <w:p>
-      <w:r>
-        <w:t>Native workbench run 19</w:t>
-      </w:r>
-    </w:p>
-    <w:p>
-      <w:r>
-        <w:t>verifies the engine hook and separation of manual panning from region residency;</w:t>
-      </w:r>
-    </w:p>
-    <w:p>
-      <w:r>
-        <w:t>it stopped and saved with zero player membership. Same-save attempt 2 has</w:t>
-      </w:r>
-    </w:p>
-    <w:p>
-      <w:r>
-        <w:t>resumed cleanly from game hour 2.659274 with the same 32 people and new</w:t>
-      </w:r>
-    </w:p>
-    <w:p>
-      <w:r>
-        <w:t>observation sequence 4. The reopened attempt's final stop and the broader SAO</w:t>
-      </w:r>
-    </w:p>
-    <w:p>
-      <w:r>
-        <w:t>body-visibility repair remain pending. A43 closes facing/vocals, participant exclusion</w:t>
-      </w:r>
-    </w:p>
-    <w:p>
-      <w:r>
-        <w:t>and residency; overall observer acceptance remains separate. Observed scenarios</w:t>
-      </w:r>
-    </w:p>
-    <w:p>
-      <w:r>
-        <w:t>require operator evaluation before dataset ratification.</w:t>
-      </w:r>
-    </w:p>
-    <w:p/>
-    <w:p>
-      <w:r>
-        <w:t>G0 closed at `[A6]`: the engine's turn surface is established from the</w:t>
-      </w:r>
-    </w:p>
-    <w:p>
-      <w:r>
-        <w:t>installed build with file-and-line evidence, in F-001 through F-011.</w:t>
-      </w:r>
-    </w:p>
-    <w:p>
-      <w:r>
-        <w:t>`[A7]` to `[A9]` read the mods that already run behaviour on turned</w:t>
-      </w:r>
-    </w:p>
-    <w:p>
-      <w:r>
-        <w:t>bodies and set what this project does with them. G1 — one controller</w:t>
-      </w:r>
-    </w:p>
-    <w:p>
-      <w:r>
-        <w:t>per body — is built: the runtime controller shipped at `[A23]` and</w:t>
-      </w:r>
-    </w:p>
-    <w:p>
-      <w:r>
-        <w:t>drives every claimed body according to its form. Its proof by</w:t>
-      </w:r>
-    </w:p>
-    <w:p>
-      <w:r>
-        <w:t>observation is owed with the era's play receipts. Two forks stand open</w:t>
-      </w:r>
-    </w:p>
-    <w:p>
-      <w:r>
-        <w:t>in the ledger: Rarity (the spread's tails; how often a settlement of</w:t>
-      </w:r>
-    </w:p>
-    <w:p>
-      <w:r>
-        <w:t>the turned forms) and Publication.</w:t>
-      </w:r>
-    </w:p>
-    <w:p/>
-    <w:p>
-      <w:r>
-        <w:t>[`SESSION_STATE.md`](SESSION_STATE.md) holds where the work stands and</w:t>
-      </w:r>
-    </w:p>
-    <w:p>
-      <w:r>
-        <w:t>[`ROADMAP.md`](ROADMAP.md) holds the gate order and the open forks.</w:t>
-      </w:r>
-    </w:p>
-    <w:p>
-      <w:r>
-        <w:t>This section states the tip and goes stale; those two are maintained.</w:t>
-      </w:r>
-    </w:p>
-    <w:p/>
-    <w:p>
       <w:pPr>
-        <w:pStyle w:val="Heading2"/>
+        <w:pStyle w:val="Heading1"/>
       </w:pPr>
       <w:r>
         <w:t>Reading order</w:t>
       </w:r>
     </w:p>
-    <w:p/>
     <w:p>
       <w:r>
-        <w:t>[`NEO.md`](NEO.md) is the instruction surface. Then [`CORE.md`](CORE.md)</w:t>
+        <w:t>NEO.md is the instruction surface. Then CORE.md for identity and the two mechanisms, ARCHITECTURE.md for the ratified shape, GOVERNANCE.md for discipline, DECISION_REGISTRY.md for what is ratified and why. The gate is tools/check.sh; the version is tools/version_replay.py's output.</w:t>
       </w:r>
     </w:p>
-    <w:p>
-      <w:r>
-        <w:t>for identity and the two mechanisms, [`ARCHITECTURE.md`](ARCHITECTURE.md)</w:t>
-      </w:r>
-    </w:p>
-    <w:p>
-      <w:r>
-        <w:t>for the ratified shape, [`GOVERNANCE.md`](GOVERNANCE.md) for discipline,</w:t>
-      </w:r>
-    </w:p>
-    <w:p>
-      <w:r>
-        <w:t>[`DECISION_REGISTRY.md`](DECISION_REGISTRY.md) for what is ratified and</w:t>
-      </w:r>
-    </w:p>
-    <w:p>
-      <w:r>
-        <w:t>why. The gate is `tools/check.sh`; the version is</w:t>
-      </w:r>
-    </w:p>
-    <w:p>
-      <w:r>
-        <w:t>[`tools/version_replay.py`](tools/version_replay.py)'s output.</w:t>
-      </w:r>
-    </w:p>
-    <w:p/>
     <w:p>
       <w:r>
         <w:t>Licensed GPL-3.0.</w:t>
       </w:r>
     </w:p>
-    <w:p/>
     <w:p>
       <w:pPr>
-        <w:pStyle w:val="Heading2"/>
+        <w:pStyle w:val="Heading1"/>
       </w:pPr>
       <w:r>
         <w:t>Loading the build</w:t>
       </w:r>
     </w:p>
-    <w:p/>
     <w:p>
       <w:r>
-        <w:t>Run `tools/deploy.sh` with the game closed. In the mods list, enable</w:t>
+        <w:t>Run tools/deploy.sh with the game closed. In the mods list, enable Zombie Awareness Overhaul. Press O to open the ZAO state panel.</w:t>
       </w:r>
     </w:p>
     <w:p>
       <w:r>
-        <w:t>**Zombie Awareness Overhaul**. Press **O** to open the ZAO state panel.</w:t>
+        <w:t>With SAO enabled, the ZAO overlay also appears in the world. Every nearby body that carries a form is labelled with that form and its normalized performance. Healthy survivors are not labelled, because a body only carries a form after the pathogen has acted on it: infected, dead, or turned.</w:t>
       </w:r>
     </w:p>
-    <w:p/>
-    <w:p>
-      <w:r>
-        <w:t>With SAO enabled, the ZAO overlay also appears in the world. Every nearby</w:t>
-      </w:r>
-    </w:p>
-    <w:p>
-      <w:r>
-        <w:t>body that carries a form is labelled with that form and its normalized</w:t>
-      </w:r>
-    </w:p>
-    <w:p>
-      <w:r>
-        <w:t>performance. Healthy survivors are not labelled, because a body only carries a</w:t>
-      </w:r>
-    </w:p>
-    <w:p>
-      <w:r>
-        <w:t>form after the pathogen has acted on it: infected, dead, or turned.</w:t>
-      </w:r>
-    </w:p>
-    <w:p/>
     <w:sectPr>
+      <w:footerReference w:type="default" r:id="rId9"/>
       <w:pgSz w:w="12240" w:h="15840"/>
-      <w:pgMar w:top="1440" w:right="1800" w:bottom="1440" w:left="1800" w:header="720" w:footer="720" w:gutter="0"/>
+      <w:pgMar w:top="749" w:right="1037" w:bottom="749" w:left="1037" w:header="720" w:footer="720" w:gutter="0"/>
       <w:cols w:space="720"/>
       <w:docGrid w:linePitch="360"/>
     </w:sectPr>
   </w:body>
 </w:document>
+</file>
+
+<file path=word/footer1.xml><?xml version="1.0" encoding="utf-8"?>
+<w:ftr xmlns:m="http://schemas.openxmlformats.org/officeDocument/2006/math" xmlns:mc="http://schemas.openxmlformats.org/markup-compatibility/2006" xmlns:mo="http://schemas.microsoft.com/office/mac/office/2008/main" xmlns:mv="urn:schemas-microsoft-com:mac:vml" xmlns:o="urn:schemas-microsoft-com:office:office" xmlns:r="http://schemas.openxmlformats.org/officeDocument/2006/relationships" xmlns:v="urn:schemas-microsoft-com:vml" xmlns:w10="urn:schemas-microsoft-com:office:word" xmlns:w14="http://schemas.microsoft.com/office/word/2010/wordml" xmlns:w="http://schemas.openxmlformats.org/wordprocessingml/2006/main" xmlns:wne="http://schemas.microsoft.com/office/word/2006/wordml" xmlns:wp14="http://schemas.microsoft.com/office/word/2010/wordprocessingDrawing" xmlns:wp="http://schemas.openxmlformats.org/drawingml/2006/wordprocessingDrawing" xmlns:wpc="http://schemas.microsoft.com/office/word/2010/wordprocessingCanvas" xmlns:wpg="http://schemas.microsoft.com/office/word/2010/wordprocessingGroup" xmlns:wpi="http://schemas.microsoft.com/office/word/2010/wordprocessingInk" xmlns:wps="http://schemas.microsoft.com/office/word/2010/wordprocessingShape" mc:Ignorable="w14 wp14">
+  <w:p>
+    <w:pPr>
+      <w:pStyle w:val="Footer"/>
+      <w:jc w:val="center"/>
+    </w:pPr>
+    <w:r>
+      <w:rPr>
+        <w:sz w:val="16"/>
+      </w:rPr>
+      <w:t>Zombie Awareness Overhaul | 0.5.4.0-pre-alpha | A44</w:t>
+    </w:r>
+  </w:p>
+</w:ftr>
 </file>
 
 <file path=word/numbering.xml><?xml version="1.0" encoding="utf-8"?>
@@ -1319,6 +747,13 @@
     <w:name w:val="Normal"/>
     <w:qFormat/>
     <w:rsid w:val="00FC693F"/>
+    <w:pPr>
+      <w:spacing w:after="70"/>
+    </w:pPr>
+    <w:rPr>
+      <w:rFonts w:ascii="Aptos" w:hAnsi="Aptos"/>
+      <w:sz w:val="18"/>
+    </w:rPr>
   </w:style>
   <w:style w:type="paragraph" w:styleId="Header">
     <w:name w:val="header"/>
@@ -1379,11 +814,11 @@
       <w:outlineLvl w:val="0"/>
     </w:pPr>
     <w:rPr>
-      <w:rFonts w:asciiTheme="majorHAnsi" w:eastAsiaTheme="majorEastAsia" w:hAnsiTheme="majorHAnsi" w:cstheme="majorBidi"/>
+      <w:rFonts w:asciiTheme="majorHAnsi" w:eastAsiaTheme="majorEastAsia" w:hAnsiTheme="majorHAnsi" w:cstheme="majorBidi" w:ascii="Aptos Display" w:hAnsi="Aptos Display"/>
       <w:b/>
       <w:bCs/>
-      <w:color w:val="365F91" w:themeColor="accent1" w:themeShade="BF"/>
-      <w:sz w:val="28"/>
+      <w:color w:val="316273"/>
+      <w:sz w:val="34"/>
       <w:szCs w:val="28"/>
     </w:rPr>
   </w:style>
@@ -1403,11 +838,11 @@
       <w:outlineLvl w:val="1"/>
     </w:pPr>
     <w:rPr>
-      <w:rFonts w:asciiTheme="majorHAnsi" w:eastAsiaTheme="majorEastAsia" w:hAnsiTheme="majorHAnsi" w:cstheme="majorBidi"/>
+      <w:rFonts w:asciiTheme="majorHAnsi" w:eastAsiaTheme="majorEastAsia" w:hAnsiTheme="majorHAnsi" w:cstheme="majorBidi" w:ascii="Aptos Display" w:hAnsi="Aptos Display"/>
       <w:b/>
       <w:bCs/>
-      <w:color w:val="4F81BD" w:themeColor="accent1"/>
-      <w:sz w:val="26"/>
+      <w:color w:val="316273"/>
+      <w:sz w:val="30"/>
       <w:szCs w:val="26"/>
     </w:rPr>
   </w:style>
@@ -1427,10 +862,11 @@
       <w:outlineLvl w:val="2"/>
     </w:pPr>
     <w:rPr>
-      <w:rFonts w:asciiTheme="majorHAnsi" w:eastAsiaTheme="majorEastAsia" w:hAnsiTheme="majorHAnsi" w:cstheme="majorBidi"/>
+      <w:rFonts w:asciiTheme="majorHAnsi" w:eastAsiaTheme="majorEastAsia" w:hAnsiTheme="majorHAnsi" w:cstheme="majorBidi" w:ascii="Aptos Display" w:hAnsi="Aptos Display"/>
       <w:b/>
       <w:bCs/>
-      <w:color w:val="4F81BD" w:themeColor="accent1"/>
+      <w:color w:val="316273"/>
+      <w:sz w:val="26"/>
     </w:rPr>
   </w:style>
   <w:style w:type="paragraph" w:styleId="Heading4">
@@ -1450,12 +886,13 @@
       <w:outlineLvl w:val="3"/>
     </w:pPr>
     <w:rPr>
-      <w:rFonts w:asciiTheme="majorHAnsi" w:eastAsiaTheme="majorEastAsia" w:hAnsiTheme="majorHAnsi" w:cstheme="majorBidi"/>
+      <w:rFonts w:asciiTheme="majorHAnsi" w:eastAsiaTheme="majorEastAsia" w:hAnsiTheme="majorHAnsi" w:cstheme="majorBidi" w:ascii="Aptos Display" w:hAnsi="Aptos Display"/>
       <w:b/>
       <w:bCs/>
       <w:i/>
       <w:iCs/>
-      <w:color w:val="4F81BD" w:themeColor="accent1"/>
+      <w:color w:val="316273"/>
+      <w:sz w:val="22"/>
     </w:rPr>
   </w:style>
   <w:style w:type="paragraph" w:styleId="Heading5">

</xml_diff>